<commit_message>
Prototype Progress Report: STI manual format (Letter, 1.5in left margin, 1.5 spacing, APA 7 tables/figures, footer), member roles and signatures
</commit_message>
<xml_diff>
--- a/report/ADMIT-Lipa_Prototype_Progress_Report.docx
+++ b/report/ADMIT-Lipa_Prototype_Progress_Report.docx
@@ -4,274 +4,330 @@
   <w:body>
     <w:p>
       <w:pPr>
-        <w:spacing w:after="0"/>
+        <w:keepNext w:val="0"/>
+        <w:spacing w:line="240" w:lineRule="auto" w:before="0" w:after="0"/>
+        <w:ind w:firstLine="0"/>
         <w:jc w:val="center"/>
       </w:pPr>
       <w:r>
         <w:rPr>
           <w:b/>
-          <w:sz w:val="28"/>
+          <w:i w:val="0"/>
         </w:rPr>
         <w:t>ADMIT-LIPA:</w:t>
       </w:r>
     </w:p>
     <w:p>
       <w:pPr>
-        <w:spacing w:after="0"/>
+        <w:keepNext w:val="0"/>
+        <w:spacing w:line="240" w:lineRule="auto" w:before="0" w:after="0"/>
+        <w:ind w:firstLine="0"/>
         <w:jc w:val="center"/>
       </w:pPr>
       <w:r>
         <w:rPr>
           <w:b/>
-          <w:sz w:val="28"/>
+          <w:i w:val="0"/>
         </w:rPr>
         <w:t>A WEB-BASED ADMISSIONS CUSTOMER RELATIONSHIP</w:t>
       </w:r>
     </w:p>
     <w:p>
       <w:pPr>
-        <w:spacing w:after="0"/>
+        <w:keepNext w:val="0"/>
+        <w:spacing w:line="240" w:lineRule="auto" w:before="0" w:after="0"/>
+        <w:ind w:firstLine="0"/>
         <w:jc w:val="center"/>
       </w:pPr>
       <w:r>
         <w:rPr>
           <w:b/>
-          <w:sz w:val="28"/>
+          <w:i w:val="0"/>
         </w:rPr>
         <w:t>MANAGEMENT SYSTEM FOR THE ADMISSIONS OFFICE</w:t>
       </w:r>
     </w:p>
     <w:p>
       <w:pPr>
-        <w:spacing w:after="480"/>
+        <w:keepNext w:val="0"/>
+        <w:spacing w:line="240" w:lineRule="auto" w:before="0" w:after="0"/>
+        <w:ind w:firstLine="0"/>
         <w:jc w:val="center"/>
       </w:pPr>
       <w:r>
         <w:rPr>
           <w:b/>
-          <w:sz w:val="28"/>
+          <w:i w:val="0"/>
         </w:rPr>
         <w:t>OF STI COLLEGE LIPA</w:t>
       </w:r>
     </w:p>
     <w:p>
       <w:pPr>
-        <w:spacing w:after="0"/>
+        <w:keepNext w:val="0"/>
+        <w:spacing w:line="240" w:lineRule="auto" w:before="0" w:after="480"/>
+        <w:ind w:firstLine="0"/>
+        <w:jc w:val="center"/>
+      </w:pPr>
+      <w:r>
+        <w:rPr>
+          <w:b w:val="0"/>
+          <w:i w:val="0"/>
+        </w:rPr>
+      </w:r>
+    </w:p>
+    <w:p>
+      <w:pPr>
+        <w:keepNext w:val="0"/>
+        <w:spacing w:line="240" w:lineRule="auto" w:before="0" w:after="0"/>
+        <w:ind w:firstLine="0"/>
         <w:jc w:val="center"/>
       </w:pPr>
       <w:r>
         <w:rPr>
           <w:b/>
-          <w:sz w:val="24"/>
+          <w:i w:val="0"/>
         </w:rPr>
         <w:t>STI College Lipa</w:t>
       </w:r>
     </w:p>
     <w:p>
       <w:pPr>
-        <w:spacing w:after="0"/>
+        <w:keepNext w:val="0"/>
+        <w:spacing w:line="240" w:lineRule="auto" w:before="0" w:after="0"/>
+        <w:ind w:firstLine="0"/>
         <w:jc w:val="center"/>
       </w:pPr>
       <w:r>
         <w:rPr>
           <w:b w:val="0"/>
-          <w:sz w:val="24"/>
+          <w:i w:val="0"/>
         </w:rPr>
         <w:t>C. M. Recto Avenue, Barangay 6, Lipa City, Batangas</w:t>
       </w:r>
     </w:p>
     <w:p>
       <w:pPr>
-        <w:spacing w:after="480"/>
+        <w:keepNext w:val="0"/>
+        <w:spacing w:line="240" w:lineRule="auto" w:before="0" w:after="960"/>
+        <w:ind w:firstLine="0"/>
         <w:jc w:val="center"/>
       </w:pPr>
       <w:r>
         <w:rPr>
           <w:b w:val="0"/>
-          <w:sz w:val="24"/>
+          <w:i w:val="0"/>
         </w:rPr>
         <w:t>School of Information and Communications Technology</w:t>
       </w:r>
     </w:p>
     <w:p>
       <w:pPr>
-        <w:spacing w:after="480"/>
+        <w:keepNext w:val="0"/>
+        <w:spacing w:line="240" w:lineRule="auto" w:before="0" w:after="960"/>
+        <w:ind w:firstLine="0"/>
         <w:jc w:val="center"/>
       </w:pPr>
       <w:r>
         <w:rPr>
           <w:b/>
-          <w:sz w:val="26"/>
+          <w:i w:val="0"/>
         </w:rPr>
         <w:t>Prototype Progress Report</w:t>
       </w:r>
     </w:p>
     <w:p>
       <w:pPr>
-        <w:spacing w:after="0"/>
+        <w:keepNext w:val="0"/>
+        <w:spacing w:line="240" w:lineRule="auto" w:before="0" w:after="0"/>
+        <w:ind w:firstLine="0"/>
         <w:jc w:val="center"/>
       </w:pPr>
       <w:r>
         <w:rPr>
           <w:b w:val="0"/>
-          <w:sz w:val="24"/>
+          <w:i w:val="0"/>
         </w:rPr>
         <w:t>Presented in Partial Fulfillment of the Requirements in</w:t>
       </w:r>
     </w:p>
     <w:p>
       <w:pPr>
-        <w:spacing w:after="600"/>
+        <w:keepNext w:val="0"/>
+        <w:spacing w:line="240" w:lineRule="auto" w:before="0" w:after="960"/>
+        <w:ind w:firstLine="0"/>
         <w:jc w:val="center"/>
       </w:pPr>
       <w:r>
         <w:rPr>
           <w:b w:val="0"/>
-          <w:sz w:val="24"/>
+          <w:i w:val="0"/>
         </w:rPr>
         <w:t>Application Development and Emerging Technologies</w:t>
       </w:r>
     </w:p>
     <w:p>
       <w:pPr>
-        <w:spacing w:after="0"/>
+        <w:keepNext w:val="0"/>
+        <w:spacing w:line="240" w:lineRule="auto" w:before="0" w:after="0"/>
+        <w:ind w:firstLine="0"/>
         <w:jc w:val="center"/>
       </w:pPr>
       <w:r>
         <w:rPr>
           <w:b/>
-          <w:sz w:val="24"/>
+          <w:i w:val="0"/>
         </w:rPr>
         <w:t>Submitted by the Proponents:</w:t>
       </w:r>
     </w:p>
     <w:p>
       <w:pPr>
-        <w:spacing w:after="0"/>
+        <w:keepNext w:val="0"/>
+        <w:spacing w:line="240" w:lineRule="auto" w:before="0" w:after="0"/>
+        <w:ind w:firstLine="0"/>
         <w:jc w:val="center"/>
       </w:pPr>
       <w:r>
         <w:rPr>
           <w:b w:val="0"/>
-          <w:sz w:val="24"/>
+          <w:i w:val="0"/>
         </w:rPr>
         <w:t>Atienza, Kurt Judd P.</w:t>
       </w:r>
     </w:p>
     <w:p>
       <w:pPr>
-        <w:spacing w:after="0"/>
+        <w:keepNext w:val="0"/>
+        <w:spacing w:line="240" w:lineRule="auto" w:before="0" w:after="0"/>
+        <w:ind w:firstLine="0"/>
         <w:jc w:val="center"/>
       </w:pPr>
       <w:r>
         <w:rPr>
           <w:b w:val="0"/>
-          <w:sz w:val="24"/>
+          <w:i w:val="0"/>
         </w:rPr>
         <w:t>Garonia, Ian Humprey M.</w:t>
       </w:r>
     </w:p>
     <w:p>
       <w:pPr>
-        <w:spacing w:after="0"/>
+        <w:keepNext w:val="0"/>
+        <w:spacing w:line="240" w:lineRule="auto" w:before="0" w:after="0"/>
+        <w:ind w:firstLine="0"/>
         <w:jc w:val="center"/>
       </w:pPr>
       <w:r>
         <w:rPr>
           <w:b w:val="0"/>
-          <w:sz w:val="24"/>
+          <w:i w:val="0"/>
         </w:rPr>
         <w:t>Apura, Alexis H.</w:t>
       </w:r>
     </w:p>
     <w:p>
       <w:pPr>
-        <w:spacing w:after="0"/>
+        <w:keepNext w:val="0"/>
+        <w:spacing w:line="240" w:lineRule="auto" w:before="0" w:after="0"/>
+        <w:ind w:firstLine="0"/>
         <w:jc w:val="center"/>
       </w:pPr>
       <w:r>
         <w:rPr>
           <w:b w:val="0"/>
-          <w:sz w:val="24"/>
+          <w:i w:val="0"/>
         </w:rPr>
         <w:t>Tenedo, Francis Gerald G.</w:t>
       </w:r>
     </w:p>
     <w:p>
       <w:pPr>
-        <w:spacing w:after="360"/>
+        <w:keepNext w:val="0"/>
+        <w:spacing w:line="240" w:lineRule="auto" w:before="0" w:after="480"/>
+        <w:ind w:firstLine="0"/>
         <w:jc w:val="center"/>
       </w:pPr>
       <w:r>
         <w:rPr>
           <w:b w:val="0"/>
-          <w:sz w:val="24"/>
+          <w:i w:val="0"/>
         </w:rPr>
       </w:r>
     </w:p>
     <w:p>
       <w:pPr>
-        <w:spacing w:after="0"/>
+        <w:keepNext w:val="0"/>
+        <w:spacing w:line="240" w:lineRule="auto" w:before="0" w:after="0"/>
+        <w:ind w:firstLine="0"/>
         <w:jc w:val="center"/>
       </w:pPr>
       <w:r>
         <w:rPr>
           <w:b/>
-          <w:sz w:val="24"/>
+          <w:i w:val="0"/>
         </w:rPr>
         <w:t>Submitted to:</w:t>
       </w:r>
     </w:p>
     <w:p>
       <w:pPr>
-        <w:spacing w:after="0"/>
+        <w:keepNext w:val="0"/>
+        <w:spacing w:line="240" w:lineRule="auto" w:before="0" w:after="0"/>
+        <w:ind w:firstLine="0"/>
         <w:jc w:val="center"/>
       </w:pPr>
       <w:r>
         <w:rPr>
           <w:b w:val="0"/>
-          <w:sz w:val="24"/>
+          <w:i w:val="0"/>
         </w:rPr>
         <w:t>Ms. Gabrielle Hernandez</w:t>
       </w:r>
     </w:p>
     <w:p>
       <w:pPr>
-        <w:spacing w:after="480"/>
+        <w:keepNext w:val="0"/>
+        <w:spacing w:line="240" w:lineRule="auto" w:before="0" w:after="960"/>
+        <w:ind w:firstLine="0"/>
         <w:jc w:val="center"/>
       </w:pPr>
       <w:r>
         <w:rPr>
           <w:b w:val="0"/>
-          <w:sz w:val="24"/>
+          <w:i w:val="0"/>
         </w:rPr>
         <w:t>Course Facilitator</w:t>
       </w:r>
     </w:p>
     <w:p>
       <w:pPr>
-        <w:spacing w:after="0"/>
+        <w:keepNext w:val="0"/>
+        <w:spacing w:line="240" w:lineRule="auto" w:before="0" w:after="0"/>
+        <w:ind w:firstLine="0"/>
         <w:jc w:val="center"/>
       </w:pPr>
       <w:r>
         <w:rPr>
           <w:b w:val="0"/>
-          <w:sz w:val="24"/>
+          <w:i w:val="0"/>
         </w:rPr>
         <w:t>First Semester, School Year 2026-2027</w:t>
       </w:r>
     </w:p>
     <w:p>
       <w:pPr>
-        <w:spacing w:after="0"/>
+        <w:keepNext w:val="0"/>
+        <w:spacing w:line="240" w:lineRule="auto" w:before="0" w:after="0"/>
+        <w:ind w:firstLine="0"/>
         <w:jc w:val="center"/>
       </w:pPr>
       <w:r>
         <w:rPr>
           <w:b w:val="0"/>
-          <w:sz w:val="24"/>
+          <w:i w:val="0"/>
         </w:rPr>
-        <w:t>Report date: October 28, 2026</w:t>
+        <w:t>October 28, 2026</w:t>
       </w:r>
     </w:p>
     <w:p>
@@ -284,42 +340,91 @@
         <w:pStyle w:val="Heading1"/>
       </w:pPr>
       <w:r>
-        <w:t>1. Summary of Progress</w:t>
+        <w:t>Summary of Progress</w:t>
       </w:r>
     </w:p>
     <w:p>
       <w:pPr>
+        <w:keepNext w:val="0"/>
+        <w:spacing w:line="360" w:lineRule="auto" w:before="0" w:after="0"/>
+        <w:ind w:firstLine="720"/>
         <w:jc w:val="both"/>
       </w:pPr>
       <w:r>
-        <w:t>The proponents moved ADMIT-Lipa from the approved System Concept Proposal to a working web application. All fourteen use cases in the use-case diagram (Figure 1 of the proposal) now run end to end in the development build, and the automated acceptance suite passed 52 of 52 checks on October 28, 2026. Every functional requirement FR-01 to FR-14 is exercised by at least one check that follows the verification method written in the proposal.</w:t>
+        <w:t>The proponents moved ADMIT-Lipa from the approved System Concept Proposal to a working web application for the Admissions Office of STI College Lipa. The system replaces the current practice in which applicants send a screenshot of their proof of payment to the campus Facebook Messenger account for validation (STI Education Services Group, n.d.). All fourteen use cases in the use-case diagram of the proposal now run end to end in the development build, and the automated acceptance test suite passed 52 of 52 checks on October 28, 2026. Each functional requirement, FR-01 to FR-14, is exercised by at least one check that follows the verification method written in the proposal. Table 1 summarizes the status of the prototype.</w:t>
+      </w:r>
+    </w:p>
+    <w:p>
+      <w:pPr>
+        <w:keepNext/>
+        <w:spacing w:line="240" w:lineRule="auto" w:before="240" w:after="0"/>
+        <w:ind w:firstLine="0"/>
+        <w:jc w:val="left"/>
+      </w:pPr>
+      <w:r>
+        <w:rPr>
+          <w:b/>
+          <w:i w:val="0"/>
+        </w:rPr>
+        <w:t>Table 1</w:t>
+      </w:r>
+    </w:p>
+    <w:p>
+      <w:pPr>
+        <w:keepNext/>
+        <w:spacing w:line="240" w:lineRule="auto" w:before="0" w:after="120"/>
+        <w:ind w:firstLine="0"/>
+        <w:jc w:val="left"/>
+      </w:pPr>
+      <w:r>
+        <w:rPr>
+          <w:b w:val="0"/>
+          <w:i/>
+        </w:rPr>
+        <w:t>Prototype Status as of October 28, 2026</w:t>
       </w:r>
     </w:p>
     <w:tbl>
       <w:tblPr>
-        <w:tblStyle w:val="TableGrid"/>
         <w:tblW w:type="auto" w:w="0"/>
         <w:jc w:val="center"/>
         <w:tblLayout w:type="fixed"/>
         <w:tblLook w:firstColumn="1" w:firstRow="1" w:lastColumn="0" w:lastRow="0" w:noHBand="0" w:noVBand="1" w:val="04A0"/>
         <w:tblLayout w:type="fixed"/>
+        <w:tblBorders>
+          <w:top w:val="single" w:sz="8" w:space="0" w:color="000000"/>
+          <w:left w:val="nil"/>
+          <w:bottom w:val="single" w:sz="8" w:space="0" w:color="000000"/>
+          <w:right w:val="nil"/>
+          <w:insideH w:val="nil"/>
+          <w:insideV w:val="nil"/>
+        </w:tblBorders>
       </w:tblPr>
       <w:tblGrid>
-        <w:gridCol w:w="3969"/>
-        <w:gridCol w:w="5103"/>
+        <w:gridCol w:w="3770"/>
+        <w:gridCol w:w="4847"/>
       </w:tblGrid>
       <w:tr>
+        <w:trPr>
+          <w:tblHeader w:val="true"/>
+        </w:trPr>
         <w:tc>
           <w:tcPr>
-            <w:tcW w:type="dxa" w:w="3969"/>
-            <w:shd w:val="clear" w:color="auto" w:fill="D9D9D9"/>
+            <w:tcW w:type="dxa" w:w="3770"/>
+            <w:tcBorders>
+              <w:bottom w:val="single" w:sz="8" w:space="0" w:color="000000"/>
+            </w:tcBorders>
           </w:tcPr>
           <w:p>
+            <w:pPr>
+              <w:spacing w:line="240" w:lineRule="auto" w:before="40" w:after="40"/>
+              <w:ind w:firstLine="0"/>
+              <w:jc w:val="left"/>
+            </w:pPr>
             <w:r/>
             <w:r>
               <w:rPr>
                 <w:b/>
-                <w:sz w:val="20"/>
               </w:rPr>
               <w:t>Item</w:t>
             </w:r>
@@ -327,31 +432,45 @@
         </w:tc>
         <w:tc>
           <w:tcPr>
-            <w:tcW w:type="dxa" w:w="5102"/>
-            <w:shd w:val="clear" w:color="auto" w:fill="D9D9D9"/>
+            <w:tcW w:type="dxa" w:w="4847"/>
+            <w:tcBorders>
+              <w:bottom w:val="single" w:sz="8" w:space="0" w:color="000000"/>
+            </w:tcBorders>
           </w:tcPr>
           <w:p>
+            <w:pPr>
+              <w:spacing w:line="240" w:lineRule="auto" w:before="40" w:after="40"/>
+              <w:ind w:firstLine="0"/>
+              <w:jc w:val="left"/>
+            </w:pPr>
             <w:r/>
             <w:r>
               <w:rPr>
                 <w:b/>
-                <w:sz w:val="20"/>
               </w:rPr>
-              <w:t>Status as of October 28, 2026</w:t>
+              <w:t>Status</w:t>
             </w:r>
           </w:p>
         </w:tc>
       </w:tr>
       <w:tr>
+        <w:trPr>
+          <w:cantSplit w:val="true"/>
+        </w:trPr>
         <w:tc>
           <w:tcPr>
-            <w:tcW w:type="dxa" w:w="3969"/>
+            <w:tcW w:type="dxa" w:w="3770"/>
           </w:tcPr>
           <w:p>
+            <w:pPr>
+              <w:spacing w:line="240" w:lineRule="auto" w:before="40" w:after="40"/>
+              <w:ind w:firstLine="0"/>
+              <w:jc w:val="left"/>
+            </w:pPr>
             <w:r/>
             <w:r>
               <w:rPr>
-                <w:sz w:val="20"/>
+                <w:b w:val="0"/>
               </w:rPr>
               <w:t>Use cases implemented</w:t>
             </w:r>
@@ -359,13 +478,18 @@
         </w:tc>
         <w:tc>
           <w:tcPr>
-            <w:tcW w:type="dxa" w:w="5102"/>
+            <w:tcW w:type="dxa" w:w="4847"/>
           </w:tcPr>
           <w:p>
+            <w:pPr>
+              <w:spacing w:line="240" w:lineRule="auto" w:before="40" w:after="40"/>
+              <w:ind w:firstLine="0"/>
+              <w:jc w:val="left"/>
+            </w:pPr>
             <w:r/>
             <w:r>
               <w:rPr>
-                <w:sz w:val="20"/>
+                <w:b w:val="0"/>
               </w:rPr>
               <w:t>14 of 14 (UC1 to UC14)</w:t>
             </w:r>
@@ -373,15 +497,23 @@
         </w:tc>
       </w:tr>
       <w:tr>
+        <w:trPr>
+          <w:cantSplit w:val="true"/>
+        </w:trPr>
         <w:tc>
           <w:tcPr>
-            <w:tcW w:type="dxa" w:w="3969"/>
+            <w:tcW w:type="dxa" w:w="3770"/>
           </w:tcPr>
           <w:p>
+            <w:pPr>
+              <w:spacing w:line="240" w:lineRule="auto" w:before="40" w:after="40"/>
+              <w:ind w:firstLine="0"/>
+              <w:jc w:val="left"/>
+            </w:pPr>
             <w:r/>
             <w:r>
               <w:rPr>
-                <w:sz w:val="20"/>
+                <w:b w:val="0"/>
               </w:rPr>
               <w:t>Functional requirements verified by automated test</w:t>
             </w:r>
@@ -389,13 +521,18 @@
         </w:tc>
         <w:tc>
           <w:tcPr>
-            <w:tcW w:type="dxa" w:w="5102"/>
+            <w:tcW w:type="dxa" w:w="4847"/>
           </w:tcPr>
           <w:p>
+            <w:pPr>
+              <w:spacing w:line="240" w:lineRule="auto" w:before="40" w:after="40"/>
+              <w:ind w:firstLine="0"/>
+              <w:jc w:val="left"/>
+            </w:pPr>
             <w:r/>
             <w:r>
               <w:rPr>
-                <w:sz w:val="20"/>
+                <w:b w:val="0"/>
               </w:rPr>
               <w:t>14 of 14 (FR-01 to FR-14)</w:t>
             </w:r>
@@ -403,45 +540,66 @@
         </w:tc>
       </w:tr>
       <w:tr>
+        <w:trPr>
+          <w:cantSplit w:val="true"/>
+        </w:trPr>
         <w:tc>
           <w:tcPr>
-            <w:tcW w:type="dxa" w:w="3969"/>
+            <w:tcW w:type="dxa" w:w="3770"/>
           </w:tcPr>
           <w:p>
+            <w:pPr>
+              <w:spacing w:line="240" w:lineRule="auto" w:before="40" w:after="40"/>
+              <w:ind w:firstLine="0"/>
+              <w:jc w:val="left"/>
+            </w:pPr>
             <w:r/>
             <w:r>
               <w:rPr>
-                <w:sz w:val="20"/>
+                <w:b w:val="0"/>
               </w:rPr>
-              <w:t>Non-functional requirements verified by automated test</w:t>
+              <w:t>Non-functional requirements verified</w:t>
             </w:r>
           </w:p>
         </w:tc>
         <w:tc>
           <w:tcPr>
-            <w:tcW w:type="dxa" w:w="5102"/>
+            <w:tcW w:type="dxa" w:w="4847"/>
           </w:tcPr>
           <w:p>
+            <w:pPr>
+              <w:spacing w:line="240" w:lineRule="auto" w:before="40" w:after="40"/>
+              <w:ind w:firstLine="0"/>
+              <w:jc w:val="left"/>
+            </w:pPr>
             <w:r/>
             <w:r>
               <w:rPr>
-                <w:sz w:val="20"/>
+                <w:b w:val="0"/>
               </w:rPr>
-              <w:t>NFR-02, NFR-03 (in part); NFR-05 by screenshot at 390 px</w:t>
+              <w:t>NFR-02 and NFR-03 (in part) by automated test; NFR-05 checked at a 390-pixel viewport, with the 360-pixel check stated in the proposal still pending</w:t>
             </w:r>
           </w:p>
         </w:tc>
       </w:tr>
       <w:tr>
+        <w:trPr>
+          <w:cantSplit w:val="true"/>
+        </w:trPr>
         <w:tc>
           <w:tcPr>
-            <w:tcW w:type="dxa" w:w="3969"/>
+            <w:tcW w:type="dxa" w:w="3770"/>
           </w:tcPr>
           <w:p>
+            <w:pPr>
+              <w:spacing w:line="240" w:lineRule="auto" w:before="40" w:after="40"/>
+              <w:ind w:firstLine="0"/>
+              <w:jc w:val="left"/>
+            </w:pPr>
             <w:r/>
             <w:r>
               <w:rPr>
-                <w:sz w:val="20"/>
+                <w:b w:val="0"/>
               </w:rPr>
               <w:t>Screens designed and captured</w:t>
             </w:r>
@@ -449,29 +607,42 @@
         </w:tc>
         <w:tc>
           <w:tcPr>
-            <w:tcW w:type="dxa" w:w="5102"/>
+            <w:tcW w:type="dxa" w:w="4847"/>
           </w:tcPr>
           <w:p>
+            <w:pPr>
+              <w:spacing w:line="240" w:lineRule="auto" w:before="40" w:after="40"/>
+              <w:ind w:firstLine="0"/>
+              <w:jc w:val="left"/>
+            </w:pPr>
             <w:r/>
             <w:r>
               <w:rPr>
-                <w:sz w:val="20"/>
+                <w:b w:val="0"/>
               </w:rPr>
-              <w:t>13 screens, desktop (1920 x 1080) and mobile (390 x 844), light and dark</w:t>
+              <w:t>13 screens in desktop (1920 × 1080) and mobile (390 × 844) sizes</w:t>
             </w:r>
           </w:p>
         </w:tc>
       </w:tr>
       <w:tr>
+        <w:trPr>
+          <w:cantSplit w:val="true"/>
+        </w:trPr>
         <w:tc>
           <w:tcPr>
-            <w:tcW w:type="dxa" w:w="3969"/>
+            <w:tcW w:type="dxa" w:w="3770"/>
           </w:tcPr>
           <w:p>
+            <w:pPr>
+              <w:spacing w:line="240" w:lineRule="auto" w:before="40" w:after="40"/>
+              <w:ind w:firstLine="0"/>
+              <w:jc w:val="left"/>
+            </w:pPr>
             <w:r/>
             <w:r>
               <w:rPr>
-                <w:sz w:val="20"/>
+                <w:b w:val="0"/>
               </w:rPr>
               <w:t>Source code</w:t>
             </w:r>
@@ -479,13 +650,18 @@
         </w:tc>
         <w:tc>
           <w:tcPr>
-            <w:tcW w:type="dxa" w:w="5102"/>
+            <w:tcW w:type="dxa" w:w="4847"/>
           </w:tcPr>
           <w:p>
+            <w:pPr>
+              <w:spacing w:line="240" w:lineRule="auto" w:before="40" w:after="40"/>
+              <w:ind w:firstLine="0"/>
+              <w:jc w:val="left"/>
+            </w:pPr>
             <w:r/>
             <w:r>
               <w:rPr>
-                <w:sz w:val="20"/>
+                <w:b w:val="0"/>
               </w:rPr>
               <w:t>https://github.com/Tiredicey/APPDEV</w:t>
             </w:r>
@@ -493,15 +669,23 @@
         </w:tc>
       </w:tr>
       <w:tr>
+        <w:trPr>
+          <w:cantSplit w:val="true"/>
+        </w:trPr>
         <w:tc>
           <w:tcPr>
-            <w:tcW w:type="dxa" w:w="3969"/>
+            <w:tcW w:type="dxa" w:w="3770"/>
           </w:tcPr>
           <w:p>
+            <w:pPr>
+              <w:spacing w:line="240" w:lineRule="auto" w:before="40" w:after="40"/>
+              <w:ind w:firstLine="0"/>
+              <w:jc w:val="left"/>
+            </w:pPr>
             <w:r/>
             <w:r>
               <w:rPr>
-                <w:sz w:val="20"/>
+                <w:b w:val="0"/>
               </w:rPr>
               <w:t>Deployment</w:t>
             </w:r>
@@ -509,13 +693,18 @@
         </w:tc>
         <w:tc>
           <w:tcPr>
-            <w:tcW w:type="dxa" w:w="5102"/>
+            <w:tcW w:type="dxa" w:w="4847"/>
           </w:tcPr>
           <w:p>
+            <w:pPr>
+              <w:spacing w:line="240" w:lineRule="auto" w:before="40" w:after="40"/>
+              <w:ind w:firstLine="0"/>
+              <w:jc w:val="left"/>
+            </w:pPr>
             <w:r/>
             <w:r>
               <w:rPr>
-                <w:sz w:val="20"/>
+                <w:b w:val="0"/>
               </w:rPr>
               <w:t>Runs in the development environment; public hosting on Cloudflare Pages is the next step</w:t>
             </w:r>
@@ -523,41 +712,106 @@
         </w:tc>
       </w:tr>
     </w:tbl>
-    <w:p/>
+    <w:p>
+      <w:pPr>
+        <w:keepNext w:val="0"/>
+        <w:spacing w:line="240" w:lineRule="auto" w:before="0" w:after="0"/>
+        <w:ind w:firstLine="0"/>
+        <w:jc w:val="both"/>
+      </w:pPr>
+      <w:r/>
+    </w:p>
     <w:p>
       <w:pPr>
         <w:pStyle w:val="Heading1"/>
       </w:pPr>
       <w:r>
-        <w:t>2. Technology Used</w:t>
+        <w:t>Technology Used</w:t>
+      </w:r>
+    </w:p>
+    <w:p>
+      <w:pPr>
+        <w:keepNext w:val="0"/>
+        <w:spacing w:line="360" w:lineRule="auto" w:before="0" w:after="0"/>
+        <w:ind w:firstLine="720"/>
+        <w:jc w:val="both"/>
+      </w:pPr>
+      <w:r>
+        <w:t>The proponents built the prototype on the technologies listed in Table 2. Each choice keeps hosting costs low for the campus and protects the personal data that applicants submit.</w:t>
+      </w:r>
+    </w:p>
+    <w:p>
+      <w:pPr>
+        <w:keepNext/>
+        <w:spacing w:line="240" w:lineRule="auto" w:before="240" w:after="0"/>
+        <w:ind w:firstLine="0"/>
+        <w:jc w:val="left"/>
+      </w:pPr>
+      <w:r>
+        <w:rPr>
+          <w:b/>
+          <w:i w:val="0"/>
+        </w:rPr>
+        <w:t>Table 2</w:t>
+      </w:r>
+    </w:p>
+    <w:p>
+      <w:pPr>
+        <w:keepNext/>
+        <w:spacing w:line="240" w:lineRule="auto" w:before="0" w:after="120"/>
+        <w:ind w:firstLine="0"/>
+        <w:jc w:val="left"/>
+      </w:pPr>
+      <w:r>
+        <w:rPr>
+          <w:b w:val="0"/>
+          <w:i/>
+        </w:rPr>
+        <w:t>Technology Stack of the Prototype</w:t>
       </w:r>
     </w:p>
     <w:tbl>
       <w:tblPr>
-        <w:tblStyle w:val="TableGrid"/>
         <w:tblW w:type="auto" w:w="0"/>
         <w:jc w:val="center"/>
         <w:tblLayout w:type="fixed"/>
         <w:tblLook w:firstColumn="1" w:firstRow="1" w:lastColumn="0" w:lastRow="0" w:noHBand="0" w:noVBand="1" w:val="04A0"/>
         <w:tblLayout w:type="fixed"/>
+        <w:tblBorders>
+          <w:top w:val="single" w:sz="8" w:space="0" w:color="000000"/>
+          <w:left w:val="nil"/>
+          <w:bottom w:val="single" w:sz="8" w:space="0" w:color="000000"/>
+          <w:right w:val="nil"/>
+          <w:insideH w:val="nil"/>
+          <w:insideV w:val="nil"/>
+        </w:tblBorders>
       </w:tblPr>
       <w:tblGrid>
-        <w:gridCol w:w="1701"/>
-        <w:gridCol w:w="2835"/>
-        <w:gridCol w:w="4536"/>
+        <w:gridCol w:w="1723"/>
+        <w:gridCol w:w="2693"/>
+        <w:gridCol w:w="4201"/>
       </w:tblGrid>
       <w:tr>
+        <w:trPr>
+          <w:tblHeader w:val="true"/>
+        </w:trPr>
         <w:tc>
           <w:tcPr>
-            <w:tcW w:type="dxa" w:w="1701"/>
-            <w:shd w:val="clear" w:color="auto" w:fill="D9D9D9"/>
+            <w:tcW w:type="dxa" w:w="1723"/>
+            <w:tcBorders>
+              <w:bottom w:val="single" w:sz="8" w:space="0" w:color="000000"/>
+            </w:tcBorders>
           </w:tcPr>
           <w:p>
+            <w:pPr>
+              <w:spacing w:line="240" w:lineRule="auto" w:before="40" w:after="40"/>
+              <w:ind w:firstLine="0"/>
+              <w:jc w:val="left"/>
+            </w:pPr>
             <w:r/>
             <w:r>
               <w:rPr>
                 <w:b/>
-                <w:sz w:val="20"/>
               </w:rPr>
               <w:t>Layer</w:t>
             </w:r>
@@ -565,15 +819,21 @@
         </w:tc>
         <w:tc>
           <w:tcPr>
-            <w:tcW w:type="dxa" w:w="2835"/>
-            <w:shd w:val="clear" w:color="auto" w:fill="D9D9D9"/>
+            <w:tcW w:type="dxa" w:w="2693"/>
+            <w:tcBorders>
+              <w:bottom w:val="single" w:sz="8" w:space="0" w:color="000000"/>
+            </w:tcBorders>
           </w:tcPr>
           <w:p>
+            <w:pPr>
+              <w:spacing w:line="240" w:lineRule="auto" w:before="40" w:after="40"/>
+              <w:ind w:firstLine="0"/>
+              <w:jc w:val="left"/>
+            </w:pPr>
             <w:r/>
             <w:r>
               <w:rPr>
                 <w:b/>
-                <w:sz w:val="20"/>
               </w:rPr>
               <w:t>Choice</w:t>
             </w:r>
@@ -581,15 +841,21 @@
         </w:tc>
         <w:tc>
           <w:tcPr>
-            <w:tcW w:type="dxa" w:w="4535"/>
-            <w:shd w:val="clear" w:color="auto" w:fill="D9D9D9"/>
+            <w:tcW w:type="dxa" w:w="4201"/>
+            <w:tcBorders>
+              <w:bottom w:val="single" w:sz="8" w:space="0" w:color="000000"/>
+            </w:tcBorders>
           </w:tcPr>
           <w:p>
+            <w:pPr>
+              <w:spacing w:line="240" w:lineRule="auto" w:before="40" w:after="40"/>
+              <w:ind w:firstLine="0"/>
+              <w:jc w:val="left"/>
+            </w:pPr>
             <w:r/>
             <w:r>
               <w:rPr>
                 <w:b/>
-                <w:sz w:val="20"/>
               </w:rPr>
               <w:t>Reason</w:t>
             </w:r>
@@ -597,15 +863,23 @@
         </w:tc>
       </w:tr>
       <w:tr>
+        <w:trPr>
+          <w:cantSplit w:val="true"/>
+        </w:trPr>
         <w:tc>
           <w:tcPr>
-            <w:tcW w:type="dxa" w:w="1701"/>
+            <w:tcW w:type="dxa" w:w="1723"/>
           </w:tcPr>
           <w:p>
+            <w:pPr>
+              <w:spacing w:line="240" w:lineRule="auto" w:before="40" w:after="40"/>
+              <w:ind w:firstLine="0"/>
+              <w:jc w:val="left"/>
+            </w:pPr>
             <w:r/>
             <w:r>
               <w:rPr>
-                <w:sz w:val="20"/>
+                <w:b w:val="0"/>
               </w:rPr>
               <w:t>Server</w:t>
             </w:r>
@@ -613,27 +887,37 @@
         </w:tc>
         <w:tc>
           <w:tcPr>
-            <w:tcW w:type="dxa" w:w="2835"/>
+            <w:tcW w:type="dxa" w:w="2693"/>
           </w:tcPr>
           <w:p>
+            <w:pPr>
+              <w:spacing w:line="240" w:lineRule="auto" w:before="40" w:after="40"/>
+              <w:ind w:firstLine="0"/>
+              <w:jc w:val="left"/>
+            </w:pPr>
             <w:r/>
             <w:r>
               <w:rPr>
-                <w:sz w:val="20"/>
+                <w:b w:val="0"/>
               </w:rPr>
-              <w:t>Hono web framework on Cloudflare Workers / Pages</w:t>
+              <w:t>Hono web framework on Cloudflare Workers and Pages</w:t>
             </w:r>
           </w:p>
         </w:tc>
         <w:tc>
           <w:tcPr>
-            <w:tcW w:type="dxa" w:w="4535"/>
+            <w:tcW w:type="dxa" w:w="4201"/>
           </w:tcPr>
           <w:p>
+            <w:pPr>
+              <w:spacing w:line="240" w:lineRule="auto" w:before="40" w:after="40"/>
+              <w:ind w:firstLine="0"/>
+              <w:jc w:val="left"/>
+            </w:pPr>
             <w:r/>
             <w:r>
               <w:rPr>
-                <w:sz w:val="20"/>
+                <w:b w:val="0"/>
               </w:rPr>
               <w:t>Runs at the network edge; no server for the campus to maintain</w:t>
             </w:r>
@@ -641,15 +925,23 @@
         </w:tc>
       </w:tr>
       <w:tr>
+        <w:trPr>
+          <w:cantSplit w:val="true"/>
+        </w:trPr>
         <w:tc>
           <w:tcPr>
-            <w:tcW w:type="dxa" w:w="1701"/>
+            <w:tcW w:type="dxa" w:w="1723"/>
           </w:tcPr>
           <w:p>
+            <w:pPr>
+              <w:spacing w:line="240" w:lineRule="auto" w:before="40" w:after="40"/>
+              <w:ind w:firstLine="0"/>
+              <w:jc w:val="left"/>
+            </w:pPr>
             <w:r/>
             <w:r>
               <w:rPr>
-                <w:sz w:val="20"/>
+                <w:b w:val="0"/>
               </w:rPr>
               <w:t>Database</w:t>
             </w:r>
@@ -657,13 +949,18 @@
         </w:tc>
         <w:tc>
           <w:tcPr>
-            <w:tcW w:type="dxa" w:w="2835"/>
+            <w:tcW w:type="dxa" w:w="2693"/>
           </w:tcPr>
           <w:p>
+            <w:pPr>
+              <w:spacing w:line="240" w:lineRule="auto" w:before="40" w:after="40"/>
+              <w:ind w:firstLine="0"/>
+              <w:jc w:val="left"/>
+            </w:pPr>
             <w:r/>
             <w:r>
               <w:rPr>
-                <w:sz w:val="20"/>
+                <w:b w:val="0"/>
               </w:rPr>
               <w:t>Cloudflare D1 (SQLite)</w:t>
             </w:r>
@@ -671,29 +968,42 @@
         </w:tc>
         <w:tc>
           <w:tcPr>
-            <w:tcW w:type="dxa" w:w="4535"/>
+            <w:tcW w:type="dxa" w:w="4201"/>
           </w:tcPr>
           <w:p>
+            <w:pPr>
+              <w:spacing w:line="240" w:lineRule="auto" w:before="40" w:after="40"/>
+              <w:ind w:firstLine="0"/>
+              <w:jc w:val="left"/>
+            </w:pPr>
             <w:r/>
             <w:r>
               <w:rPr>
-                <w:sz w:val="20"/>
+                <w:b w:val="0"/>
               </w:rPr>
-              <w:t>Relational tables for tickets, requirements, payments and the audit log; Cloudflare states D1 encrypts data at rest and in transit (Cloudflare, 2026)</w:t>
+              <w:t>Relational tables for tickets, requirements, payments, and the audit log; D1 encrypts data at rest and in transit (Cloudflare, 2026)</w:t>
             </w:r>
           </w:p>
         </w:tc>
       </w:tr>
       <w:tr>
+        <w:trPr>
+          <w:cantSplit w:val="true"/>
+        </w:trPr>
         <w:tc>
           <w:tcPr>
-            <w:tcW w:type="dxa" w:w="1701"/>
+            <w:tcW w:type="dxa" w:w="1723"/>
           </w:tcPr>
           <w:p>
+            <w:pPr>
+              <w:spacing w:line="240" w:lineRule="auto" w:before="40" w:after="40"/>
+              <w:ind w:firstLine="0"/>
+              <w:jc w:val="left"/>
+            </w:pPr>
             <w:r/>
             <w:r>
               <w:rPr>
-                <w:sz w:val="20"/>
+                <w:b w:val="0"/>
               </w:rPr>
               <w:t>Field encryption</w:t>
             </w:r>
@@ -701,43 +1011,61 @@
         </w:tc>
         <w:tc>
           <w:tcPr>
-            <w:tcW w:type="dxa" w:w="2835"/>
+            <w:tcW w:type="dxa" w:w="2693"/>
           </w:tcPr>
           <w:p>
+            <w:pPr>
+              <w:spacing w:line="240" w:lineRule="auto" w:before="40" w:after="40"/>
+              <w:ind w:firstLine="0"/>
+              <w:jc w:val="left"/>
+            </w:pPr>
             <w:r/>
             <w:r>
               <w:rPr>
-                <w:sz w:val="20"/>
+                <w:b w:val="0"/>
               </w:rPr>
-              <w:t>AES-256-GCM via the Web Crypto API</w:t>
+              <w:t>AES-256-GCM through the Web Crypto API</w:t>
             </w:r>
           </w:p>
         </w:tc>
         <w:tc>
           <w:tcPr>
-            <w:tcW w:type="dxa" w:w="4535"/>
+            <w:tcW w:type="dxa" w:w="4201"/>
           </w:tcPr>
           <w:p>
+            <w:pPr>
+              <w:spacing w:line="240" w:lineRule="auto" w:before="40" w:after="40"/>
+              <w:ind w:firstLine="0"/>
+              <w:jc w:val="left"/>
+            </w:pPr>
             <w:r/>
             <w:r>
               <w:rPr>
-                <w:sz w:val="20"/>
+                <w:b w:val="0"/>
               </w:rPr>
-              <w:t>Date of birth, mobile number, address and financial-aid answers are encrypted before they reach the database (NFR-03)</w:t>
+              <w:t>Date of birth, mobile number, address, and financial aid answers are encrypted before they reach the database (NFR-03)</w:t>
             </w:r>
           </w:p>
         </w:tc>
       </w:tr>
       <w:tr>
+        <w:trPr>
+          <w:cantSplit w:val="true"/>
+        </w:trPr>
         <w:tc>
           <w:tcPr>
-            <w:tcW w:type="dxa" w:w="1701"/>
+            <w:tcW w:type="dxa" w:w="1723"/>
           </w:tcPr>
           <w:p>
+            <w:pPr>
+              <w:spacing w:line="240" w:lineRule="auto" w:before="40" w:after="40"/>
+              <w:ind w:firstLine="0"/>
+              <w:jc w:val="left"/>
+            </w:pPr>
             <w:r/>
             <w:r>
               <w:rPr>
-                <w:sz w:val="20"/>
+                <w:b w:val="0"/>
               </w:rPr>
               <w:t>Passwords</w:t>
             </w:r>
@@ -745,13 +1073,18 @@
         </w:tc>
         <w:tc>
           <w:tcPr>
-            <w:tcW w:type="dxa" w:w="2835"/>
+            <w:tcW w:type="dxa" w:w="2693"/>
           </w:tcPr>
           <w:p>
+            <w:pPr>
+              <w:spacing w:line="240" w:lineRule="auto" w:before="40" w:after="40"/>
+              <w:ind w:firstLine="0"/>
+              <w:jc w:val="left"/>
+            </w:pPr>
             <w:r/>
             <w:r>
               <w:rPr>
-                <w:sz w:val="20"/>
+                <w:b w:val="0"/>
               </w:rPr>
               <w:t>PBKDF2-SHA-256, 100,000 iterations, per-user salt</w:t>
             </w:r>
@@ -759,29 +1092,42 @@
         </w:tc>
         <w:tc>
           <w:tcPr>
-            <w:tcW w:type="dxa" w:w="4535"/>
+            <w:tcW w:type="dxa" w:w="4201"/>
           </w:tcPr>
           <w:p>
+            <w:pPr>
+              <w:spacing w:line="240" w:lineRule="auto" w:before="40" w:after="40"/>
+              <w:ind w:firstLine="0"/>
+              <w:jc w:val="left"/>
+            </w:pPr>
             <w:r/>
             <w:r>
               <w:rPr>
-                <w:sz w:val="20"/>
+                <w:b w:val="0"/>
               </w:rPr>
-              <w:t>No plain-text passwords stored</w:t>
+              <w:t>No plain-text passwords are stored</w:t>
             </w:r>
           </w:p>
         </w:tc>
       </w:tr>
       <w:tr>
+        <w:trPr>
+          <w:cantSplit w:val="true"/>
+        </w:trPr>
         <w:tc>
           <w:tcPr>
-            <w:tcW w:type="dxa" w:w="1701"/>
+            <w:tcW w:type="dxa" w:w="1723"/>
           </w:tcPr>
           <w:p>
+            <w:pPr>
+              <w:spacing w:line="240" w:lineRule="auto" w:before="40" w:after="40"/>
+              <w:ind w:firstLine="0"/>
+              <w:jc w:val="left"/>
+            </w:pPr>
             <w:r/>
             <w:r>
               <w:rPr>
-                <w:sz w:val="20"/>
+                <w:b w:val="0"/>
               </w:rPr>
               <w:t>Front end</w:t>
             </w:r>
@@ -789,27 +1135,37 @@
         </w:tc>
         <w:tc>
           <w:tcPr>
-            <w:tcW w:type="dxa" w:w="2835"/>
+            <w:tcW w:type="dxa" w:w="2693"/>
           </w:tcPr>
           <w:p>
+            <w:pPr>
+              <w:spacing w:line="240" w:lineRule="auto" w:before="40" w:after="40"/>
+              <w:ind w:firstLine="0"/>
+              <w:jc w:val="left"/>
+            </w:pPr>
             <w:r/>
             <w:r>
               <w:rPr>
-                <w:sz w:val="20"/>
+                <w:b w:val="0"/>
               </w:rPr>
-              <w:t>Plain JavaScript single-page app, IBM Plex type, no framework</w:t>
+              <w:t>Plain JavaScript single-page application</w:t>
             </w:r>
           </w:p>
         </w:tc>
         <w:tc>
           <w:tcPr>
-            <w:tcW w:type="dxa" w:w="4535"/>
+            <w:tcW w:type="dxa" w:w="4201"/>
           </w:tcPr>
           <w:p>
+            <w:pPr>
+              <w:spacing w:line="240" w:lineRule="auto" w:before="40" w:after="40"/>
+              <w:ind w:firstLine="0"/>
+              <w:jc w:val="left"/>
+            </w:pPr>
             <w:r/>
             <w:r>
               <w:rPr>
-                <w:sz w:val="20"/>
+                <w:b w:val="0"/>
               </w:rPr>
               <w:t>Small download for mobile users on slow connections</w:t>
             </w:r>
@@ -817,15 +1173,23 @@
         </w:tc>
       </w:tr>
       <w:tr>
+        <w:trPr>
+          <w:cantSplit w:val="true"/>
+        </w:trPr>
         <w:tc>
           <w:tcPr>
-            <w:tcW w:type="dxa" w:w="1701"/>
+            <w:tcW w:type="dxa" w:w="1723"/>
           </w:tcPr>
           <w:p>
+            <w:pPr>
+              <w:spacing w:line="240" w:lineRule="auto" w:before="40" w:after="40"/>
+              <w:ind w:firstLine="0"/>
+              <w:jc w:val="left"/>
+            </w:pPr>
             <w:r/>
             <w:r>
               <w:rPr>
-                <w:sz w:val="20"/>
+                <w:b w:val="0"/>
               </w:rPr>
               <w:t>Development assistant</w:t>
             </w:r>
@@ -833,13 +1197,18 @@
         </w:tc>
         <w:tc>
           <w:tcPr>
-            <w:tcW w:type="dxa" w:w="2835"/>
+            <w:tcW w:type="dxa" w:w="2693"/>
           </w:tcPr>
           <w:p>
+            <w:pPr>
+              <w:spacing w:line="240" w:lineRule="auto" w:before="40" w:after="40"/>
+              <w:ind w:firstLine="0"/>
+              <w:jc w:val="left"/>
+            </w:pPr>
             <w:r/>
             <w:r>
               <w:rPr>
-                <w:sz w:val="20"/>
+                <w:b w:val="0"/>
               </w:rPr>
               <w:t>Genspark AI coding agent</w:t>
             </w:r>
@@ -847,56 +1216,126 @@
         </w:tc>
         <w:tc>
           <w:tcPr>
-            <w:tcW w:type="dxa" w:w="4535"/>
+            <w:tcW w:type="dxa" w:w="4201"/>
           </w:tcPr>
           <w:p>
+            <w:pPr>
+              <w:spacing w:line="240" w:lineRule="auto" w:before="40" w:after="40"/>
+              <w:ind w:firstLine="0"/>
+              <w:jc w:val="left"/>
+            </w:pPr>
             <w:r/>
             <w:r>
               <w:rPr>
-                <w:sz w:val="20"/>
+                <w:b w:val="0"/>
               </w:rPr>
-              <w:t>Generated code, tests and the background video under the proponents' direction; the team reviewed the screens and tested the prototype</w:t>
+              <w:t>Generated code, tests, and the background video under the proponents' direction; the team reviewed the screens and tested the prototype</w:t>
             </w:r>
           </w:p>
         </w:tc>
       </w:tr>
     </w:tbl>
-    <w:p/>
+    <w:p>
+      <w:pPr>
+        <w:keepNext w:val="0"/>
+        <w:spacing w:line="240" w:lineRule="auto" w:before="0" w:after="0"/>
+        <w:ind w:firstLine="0"/>
+        <w:jc w:val="both"/>
+      </w:pPr>
+      <w:r/>
+    </w:p>
     <w:p>
       <w:pPr>
         <w:pStyle w:val="Heading1"/>
       </w:pPr>
       <w:r>
-        <w:t>3. Requirement Traceability: What Was Built and How It Was Verified</w:t>
+        <w:t>Requirement Traceability</w:t>
+      </w:r>
+    </w:p>
+    <w:p>
+      <w:pPr>
+        <w:keepNext w:val="0"/>
+        <w:spacing w:line="360" w:lineRule="auto" w:before="0" w:after="0"/>
+        <w:ind w:firstLine="720"/>
+        <w:jc w:val="both"/>
+      </w:pPr>
+      <w:r>
+        <w:t>Table 3 lists each functional requirement, the use case it traces to, the behavior implemented in the prototype, and the result of its automated verification.</w:t>
+      </w:r>
+    </w:p>
+    <w:p>
+      <w:pPr>
+        <w:keepNext/>
+        <w:spacing w:line="240" w:lineRule="auto" w:before="240" w:after="0"/>
+        <w:ind w:firstLine="0"/>
+        <w:jc w:val="left"/>
+      </w:pPr>
+      <w:r>
+        <w:rPr>
+          <w:b/>
+          <w:i w:val="0"/>
+        </w:rPr>
+        <w:t>Table 3</w:t>
+      </w:r>
+    </w:p>
+    <w:p>
+      <w:pPr>
+        <w:keepNext/>
+        <w:spacing w:line="240" w:lineRule="auto" w:before="0" w:after="120"/>
+        <w:ind w:firstLine="0"/>
+        <w:jc w:val="left"/>
+      </w:pPr>
+      <w:r>
+        <w:rPr>
+          <w:b w:val="0"/>
+          <w:i/>
+        </w:rPr>
+        <w:t>Functional Requirements Implemented and Verified</w:t>
       </w:r>
     </w:p>
     <w:tbl>
       <w:tblPr>
-        <w:tblStyle w:val="TableGrid"/>
         <w:tblW w:type="auto" w:w="0"/>
         <w:jc w:val="center"/>
         <w:tblLayout w:type="fixed"/>
         <w:tblLook w:firstColumn="1" w:firstRow="1" w:lastColumn="0" w:lastRow="0" w:noHBand="0" w:noVBand="1" w:val="04A0"/>
         <w:tblLayout w:type="fixed"/>
+        <w:tblBorders>
+          <w:top w:val="single" w:sz="8" w:space="0" w:color="000000"/>
+          <w:left w:val="nil"/>
+          <w:bottom w:val="single" w:sz="8" w:space="0" w:color="000000"/>
+          <w:right w:val="nil"/>
+          <w:insideH w:val="single" w:sz="8" w:space="0" w:color="000000"/>
+          <w:insideV w:val="nil"/>
+        </w:tblBorders>
       </w:tblPr>
       <w:tblGrid>
-        <w:gridCol w:w="907"/>
-        <w:gridCol w:w="963"/>
-        <w:gridCol w:w="6237"/>
-        <w:gridCol w:w="963"/>
+        <w:gridCol w:w="945"/>
+        <w:gridCol w:w="1056"/>
+        <w:gridCol w:w="5560"/>
+        <w:gridCol w:w="1056"/>
       </w:tblGrid>
       <w:tr>
+        <w:trPr>
+          <w:tblHeader w:val="true"/>
+        </w:trPr>
         <w:tc>
           <w:tcPr>
-            <w:tcW w:type="dxa" w:w="907"/>
-            <w:shd w:val="clear" w:color="auto" w:fill="D9D9D9"/>
+            <w:tcW w:type="dxa" w:w="945"/>
+            <w:tcBorders>
+              <w:bottom w:val="single" w:sz="8" w:space="0" w:color="000000"/>
+            </w:tcBorders>
           </w:tcPr>
           <w:p>
+            <w:pPr>
+              <w:spacing w:line="240" w:lineRule="auto" w:before="40" w:after="40"/>
+              <w:ind w:firstLine="0"/>
+              <w:jc w:val="left"/>
+            </w:pPr>
             <w:r/>
             <w:r>
               <w:rPr>
                 <w:b/>
-                <w:sz w:val="18"/>
               </w:rPr>
               <w:t>Req.</w:t>
             </w:r>
@@ -904,47 +1343,65 @@
         </w:tc>
         <w:tc>
           <w:tcPr>
-            <w:tcW w:type="dxa" w:w="964"/>
-            <w:shd w:val="clear" w:color="auto" w:fill="D9D9D9"/>
+            <w:tcW w:type="dxa" w:w="1056"/>
+            <w:tcBorders>
+              <w:bottom w:val="single" w:sz="8" w:space="0" w:color="000000"/>
+            </w:tcBorders>
           </w:tcPr>
           <w:p>
+            <w:pPr>
+              <w:spacing w:line="240" w:lineRule="auto" w:before="40" w:after="40"/>
+              <w:ind w:firstLine="0"/>
+              <w:jc w:val="left"/>
+            </w:pPr>
             <w:r/>
             <w:r>
               <w:rPr>
                 <w:b/>
-                <w:sz w:val="18"/>
               </w:rPr>
-              <w:t>Use case</w:t>
+              <w:t>Use Case</w:t>
             </w:r>
           </w:p>
         </w:tc>
         <w:tc>
           <w:tcPr>
-            <w:tcW w:type="dxa" w:w="6236"/>
-            <w:shd w:val="clear" w:color="auto" w:fill="D9D9D9"/>
+            <w:tcW w:type="dxa" w:w="5560"/>
+            <w:tcBorders>
+              <w:bottom w:val="single" w:sz="8" w:space="0" w:color="000000"/>
+            </w:tcBorders>
           </w:tcPr>
           <w:p>
+            <w:pPr>
+              <w:spacing w:line="240" w:lineRule="auto" w:before="40" w:after="40"/>
+              <w:ind w:firstLine="0"/>
+              <w:jc w:val="left"/>
+            </w:pPr>
             <w:r/>
             <w:r>
               <w:rPr>
                 <w:b/>
-                <w:sz w:val="18"/>
               </w:rPr>
-              <w:t>Implemented behavior</w:t>
+              <w:t>Implemented Behavior</w:t>
             </w:r>
           </w:p>
         </w:tc>
         <w:tc>
           <w:tcPr>
-            <w:tcW w:type="dxa" w:w="964"/>
-            <w:shd w:val="clear" w:color="auto" w:fill="D9D9D9"/>
+            <w:tcW w:type="dxa" w:w="1056"/>
+            <w:tcBorders>
+              <w:bottom w:val="single" w:sz="8" w:space="0" w:color="000000"/>
+            </w:tcBorders>
           </w:tcPr>
           <w:p>
+            <w:pPr>
+              <w:spacing w:line="240" w:lineRule="auto" w:before="40" w:after="40"/>
+              <w:ind w:firstLine="0"/>
+              <w:jc w:val="left"/>
+            </w:pPr>
             <w:r/>
             <w:r>
               <w:rPr>
                 <w:b/>
-                <w:sz w:val="18"/>
               </w:rPr>
               <w:t>Result</w:t>
             </w:r>
@@ -952,15 +1409,23 @@
         </w:tc>
       </w:tr>
       <w:tr>
+        <w:trPr>
+          <w:cantSplit w:val="true"/>
+        </w:trPr>
         <w:tc>
           <w:tcPr>
-            <w:tcW w:type="dxa" w:w="907"/>
+            <w:tcW w:type="dxa" w:w="945"/>
           </w:tcPr>
           <w:p>
+            <w:pPr>
+              <w:spacing w:line="240" w:lineRule="auto" w:before="40" w:after="40"/>
+              <w:ind w:firstLine="0"/>
+              <w:jc w:val="left"/>
+            </w:pPr>
             <w:r/>
             <w:r>
               <w:rPr>
-                <w:sz w:val="18"/>
+                <w:b w:val="0"/>
               </w:rPr>
               <w:t>FR-01</w:t>
             </w:r>
@@ -968,13 +1433,18 @@
         </w:tc>
         <w:tc>
           <w:tcPr>
-            <w:tcW w:type="dxa" w:w="964"/>
+            <w:tcW w:type="dxa" w:w="1056"/>
           </w:tcPr>
           <w:p>
+            <w:pPr>
+              <w:spacing w:line="240" w:lineRule="auto" w:before="40" w:after="40"/>
+              <w:ind w:firstLine="0"/>
+              <w:jc w:val="left"/>
+            </w:pPr>
             <w:r/>
             <w:r>
               <w:rPr>
-                <w:sz w:val="18"/>
+                <w:b w:val="0"/>
               </w:rPr>
               <w:t>UC1</w:t>
             </w:r>
@@ -982,43 +1452,61 @@
         </w:tc>
         <w:tc>
           <w:tcPr>
-            <w:tcW w:type="dxa" w:w="6236"/>
+            <w:tcW w:type="dxa" w:w="5560"/>
           </w:tcPr>
           <w:p>
+            <w:pPr>
+              <w:spacing w:line="240" w:lineRule="auto" w:before="40" w:after="40"/>
+              <w:ind w:firstLine="0"/>
+              <w:jc w:val="left"/>
+            </w:pPr>
             <w:r/>
             <w:r>
               <w:rPr>
-                <w:sz w:val="18"/>
+                <w:b w:val="0"/>
               </w:rPr>
-              <w:t>Inquiry form returns a ticket number such as ADM-2026-00001 in the same session and stores it</w:t>
+              <w:t>The inquiry form returns a ticket number such as ADM-2026-00001 in the same session and stores it</w:t>
             </w:r>
           </w:p>
         </w:tc>
         <w:tc>
           <w:tcPr>
-            <w:tcW w:type="dxa" w:w="964"/>
+            <w:tcW w:type="dxa" w:w="1056"/>
           </w:tcPr>
           <w:p>
+            <w:pPr>
+              <w:spacing w:line="240" w:lineRule="auto" w:before="40" w:after="40"/>
+              <w:ind w:firstLine="0"/>
+              <w:jc w:val="left"/>
+            </w:pPr>
             <w:r/>
             <w:r>
               <w:rPr>
-                <w:sz w:val="18"/>
+                <w:b w:val="0"/>
               </w:rPr>
-              <w:t>PASS</w:t>
+              <w:t>Pass</w:t>
             </w:r>
           </w:p>
         </w:tc>
       </w:tr>
       <w:tr>
+        <w:trPr>
+          <w:cantSplit w:val="true"/>
+        </w:trPr>
         <w:tc>
           <w:tcPr>
-            <w:tcW w:type="dxa" w:w="907"/>
+            <w:tcW w:type="dxa" w:w="945"/>
           </w:tcPr>
           <w:p>
+            <w:pPr>
+              <w:spacing w:line="240" w:lineRule="auto" w:before="40" w:after="40"/>
+              <w:ind w:firstLine="0"/>
+              <w:jc w:val="left"/>
+            </w:pPr>
             <w:r/>
             <w:r>
               <w:rPr>
-                <w:sz w:val="18"/>
+                <w:b w:val="0"/>
               </w:rPr>
               <w:t>FR-02</w:t>
             </w:r>
@@ -1026,13 +1514,18 @@
         </w:tc>
         <w:tc>
           <w:tcPr>
-            <w:tcW w:type="dxa" w:w="964"/>
+            <w:tcW w:type="dxa" w:w="1056"/>
           </w:tcPr>
           <w:p>
+            <w:pPr>
+              <w:spacing w:line="240" w:lineRule="auto" w:before="40" w:after="40"/>
+              <w:ind w:firstLine="0"/>
+              <w:jc w:val="left"/>
+            </w:pPr>
             <w:r/>
             <w:r>
               <w:rPr>
-                <w:sz w:val="18"/>
+                <w:b w:val="0"/>
               </w:rPr>
               <w:t>UC2</w:t>
             </w:r>
@@ -1040,43 +1533,61 @@
         </w:tc>
         <w:tc>
           <w:tcPr>
-            <w:tcW w:type="dxa" w:w="6236"/>
+            <w:tcW w:type="dxa" w:w="5560"/>
           </w:tcPr>
           <w:p>
+            <w:pPr>
+              <w:spacing w:line="240" w:lineRule="auto" w:before="40" w:after="40"/>
+              <w:ind w:firstLine="0"/>
+              <w:jc w:val="left"/>
+            </w:pPr>
             <w:r/>
             <w:r>
               <w:rPr>
-                <w:sz w:val="18"/>
+                <w:b w:val="0"/>
               </w:rPr>
-              <w:t>Second profile with the same surname, first name and date of birth is blocked with a message (keyed HMAC index, so the duplicate check works on encrypted data)</w:t>
+              <w:t>A second profile with the same surname, first name, and date of birth is blocked with a message; the check works on encrypted data through a keyed index</w:t>
             </w:r>
           </w:p>
         </w:tc>
         <w:tc>
           <w:tcPr>
-            <w:tcW w:type="dxa" w:w="964"/>
+            <w:tcW w:type="dxa" w:w="1056"/>
           </w:tcPr>
           <w:p>
+            <w:pPr>
+              <w:spacing w:line="240" w:lineRule="auto" w:before="40" w:after="40"/>
+              <w:ind w:firstLine="0"/>
+              <w:jc w:val="left"/>
+            </w:pPr>
             <w:r/>
             <w:r>
               <w:rPr>
-                <w:sz w:val="18"/>
+                <w:b w:val="0"/>
               </w:rPr>
-              <w:t>PASS</w:t>
+              <w:t>Pass</w:t>
             </w:r>
           </w:p>
         </w:tc>
       </w:tr>
       <w:tr>
+        <w:trPr>
+          <w:cantSplit w:val="true"/>
+        </w:trPr>
         <w:tc>
           <w:tcPr>
-            <w:tcW w:type="dxa" w:w="907"/>
+            <w:tcW w:type="dxa" w:w="945"/>
           </w:tcPr>
           <w:p>
+            <w:pPr>
+              <w:spacing w:line="240" w:lineRule="auto" w:before="40" w:after="40"/>
+              <w:ind w:firstLine="0"/>
+              <w:jc w:val="left"/>
+            </w:pPr>
             <w:r/>
             <w:r>
               <w:rPr>
-                <w:sz w:val="18"/>
+                <w:b w:val="0"/>
               </w:rPr>
               <w:t>FR-03</w:t>
             </w:r>
@@ -1084,13 +1595,18 @@
         </w:tc>
         <w:tc>
           <w:tcPr>
-            <w:tcW w:type="dxa" w:w="964"/>
+            <w:tcW w:type="dxa" w:w="1056"/>
           </w:tcPr>
           <w:p>
+            <w:pPr>
+              <w:spacing w:line="240" w:lineRule="auto" w:before="40" w:after="40"/>
+              <w:ind w:firstLine="0"/>
+              <w:jc w:val="left"/>
+            </w:pPr>
             <w:r/>
             <w:r>
               <w:rPr>
-                <w:sz w:val="18"/>
+                <w:b w:val="0"/>
               </w:rPr>
               <w:t>UC3</w:t>
             </w:r>
@@ -1098,43 +1614,61 @@
         </w:tc>
         <w:tc>
           <w:tcPr>
-            <w:tcW w:type="dxa" w:w="6236"/>
+            <w:tcW w:type="dxa" w:w="5560"/>
           </w:tcPr>
           <w:p>
+            <w:pPr>
+              <w:spacing w:line="240" w:lineRule="auto" w:before="40" w:after="40"/>
+              <w:ind w:firstLine="0"/>
+              <w:jc w:val="left"/>
+            </w:pPr>
             <w:r/>
             <w:r>
               <w:rPr>
-                <w:sz w:val="18"/>
+                <w:b w:val="0"/>
               </w:rPr>
-              <w:t>Each required document shows received, pending or rejected; a rejection requires a reason</w:t>
+              <w:t>Each required document shows received, pending, or rejected; a rejection requires a reason</w:t>
             </w:r>
           </w:p>
         </w:tc>
         <w:tc>
           <w:tcPr>
-            <w:tcW w:type="dxa" w:w="964"/>
+            <w:tcW w:type="dxa" w:w="1056"/>
           </w:tcPr>
           <w:p>
+            <w:pPr>
+              <w:spacing w:line="240" w:lineRule="auto" w:before="40" w:after="40"/>
+              <w:ind w:firstLine="0"/>
+              <w:jc w:val="left"/>
+            </w:pPr>
             <w:r/>
             <w:r>
               <w:rPr>
-                <w:sz w:val="18"/>
+                <w:b w:val="0"/>
               </w:rPr>
-              <w:t>PASS</w:t>
+              <w:t>Pass</w:t>
             </w:r>
           </w:p>
         </w:tc>
       </w:tr>
       <w:tr>
+        <w:trPr>
+          <w:cantSplit w:val="true"/>
+        </w:trPr>
         <w:tc>
           <w:tcPr>
-            <w:tcW w:type="dxa" w:w="907"/>
+            <w:tcW w:type="dxa" w:w="945"/>
           </w:tcPr>
           <w:p>
+            <w:pPr>
+              <w:spacing w:line="240" w:lineRule="auto" w:before="40" w:after="40"/>
+              <w:ind w:firstLine="0"/>
+              <w:jc w:val="left"/>
+            </w:pPr>
             <w:r/>
             <w:r>
               <w:rPr>
-                <w:sz w:val="18"/>
+                <w:b w:val="0"/>
               </w:rPr>
               <w:t>FR-04</w:t>
             </w:r>
@@ -1142,13 +1676,18 @@
         </w:tc>
         <w:tc>
           <w:tcPr>
-            <w:tcW w:type="dxa" w:w="964"/>
+            <w:tcW w:type="dxa" w:w="1056"/>
           </w:tcPr>
           <w:p>
+            <w:pPr>
+              <w:spacing w:line="240" w:lineRule="auto" w:before="40" w:after="40"/>
+              <w:ind w:firstLine="0"/>
+              <w:jc w:val="left"/>
+            </w:pPr>
             <w:r/>
             <w:r>
               <w:rPr>
-                <w:sz w:val="18"/>
+                <w:b w:val="0"/>
               </w:rPr>
               <w:t>UC4</w:t>
             </w:r>
@@ -1156,43 +1695,61 @@
         </w:tc>
         <w:tc>
           <w:tcPr>
-            <w:tcW w:type="dxa" w:w="6236"/>
+            <w:tcW w:type="dxa" w:w="5560"/>
           </w:tcPr>
           <w:p>
+            <w:pPr>
+              <w:spacing w:line="240" w:lineRule="auto" w:before="40" w:after="40"/>
+              <w:ind w:firstLine="0"/>
+              <w:jc w:val="left"/>
+            </w:pPr>
             <w:r/>
             <w:r>
               <w:rPr>
-                <w:sz w:val="18"/>
+                <w:b w:val="0"/>
               </w:rPr>
-              <w:t>TES, TES-3A, TDP and SHS Voucher flagged from the encoded profile; boundary tested at P400,000 and P400,001</w:t>
+              <w:t>TES, TES-3A, and TDP (Unified Student Financial Assistance System for Tertiary Education, n.d.) and the SHS Voucher (Department of Education, n.d.) are flagged from the encoded profile; the income ceiling was tested at P400,000 and P400,001</w:t>
             </w:r>
           </w:p>
         </w:tc>
         <w:tc>
           <w:tcPr>
-            <w:tcW w:type="dxa" w:w="964"/>
+            <w:tcW w:type="dxa" w:w="1056"/>
           </w:tcPr>
           <w:p>
+            <w:pPr>
+              <w:spacing w:line="240" w:lineRule="auto" w:before="40" w:after="40"/>
+              <w:ind w:firstLine="0"/>
+              <w:jc w:val="left"/>
+            </w:pPr>
             <w:r/>
             <w:r>
               <w:rPr>
-                <w:sz w:val="18"/>
+                <w:b w:val="0"/>
               </w:rPr>
-              <w:t>PASS</w:t>
+              <w:t>Pass</w:t>
             </w:r>
           </w:p>
         </w:tc>
       </w:tr>
       <w:tr>
+        <w:trPr>
+          <w:cantSplit w:val="true"/>
+        </w:trPr>
         <w:tc>
           <w:tcPr>
-            <w:tcW w:type="dxa" w:w="907"/>
+            <w:tcW w:type="dxa" w:w="945"/>
           </w:tcPr>
           <w:p>
+            <w:pPr>
+              <w:spacing w:line="240" w:lineRule="auto" w:before="40" w:after="40"/>
+              <w:ind w:firstLine="0"/>
+              <w:jc w:val="left"/>
+            </w:pPr>
             <w:r/>
             <w:r>
               <w:rPr>
-                <w:sz w:val="18"/>
+                <w:b w:val="0"/>
               </w:rPr>
               <w:t>FR-05</w:t>
             </w:r>
@@ -1200,13 +1757,18 @@
         </w:tc>
         <w:tc>
           <w:tcPr>
-            <w:tcW w:type="dxa" w:w="964"/>
+            <w:tcW w:type="dxa" w:w="1056"/>
           </w:tcPr>
           <w:p>
+            <w:pPr>
+              <w:spacing w:line="240" w:lineRule="auto" w:before="40" w:after="40"/>
+              <w:ind w:firstLine="0"/>
+              <w:jc w:val="left"/>
+            </w:pPr>
             <w:r/>
             <w:r>
               <w:rPr>
-                <w:sz w:val="18"/>
+                <w:b w:val="0"/>
               </w:rPr>
               <w:t>UC5</w:t>
             </w:r>
@@ -1214,43 +1776,61 @@
         </w:tc>
         <w:tc>
           <w:tcPr>
-            <w:tcW w:type="dxa" w:w="6236"/>
+            <w:tcW w:type="dxa" w:w="5560"/>
           </w:tcPr>
           <w:p>
+            <w:pPr>
+              <w:spacing w:line="240" w:lineRule="auto" w:before="40" w:after="40"/>
+              <w:ind w:firstLine="0"/>
+              <w:jc w:val="left"/>
+            </w:pPr>
             <w:r/>
             <w:r>
               <w:rPr>
-                <w:sz w:val="18"/>
+                <w:b w:val="0"/>
               </w:rPr>
-              <w:t>Applicant sees own stage only; opening another record returns "forbidden"</w:t>
+              <w:t>An applicant sees only his or her own stage; opening another record is refused</w:t>
             </w:r>
           </w:p>
         </w:tc>
         <w:tc>
           <w:tcPr>
-            <w:tcW w:type="dxa" w:w="964"/>
+            <w:tcW w:type="dxa" w:w="1056"/>
           </w:tcPr>
           <w:p>
+            <w:pPr>
+              <w:spacing w:line="240" w:lineRule="auto" w:before="40" w:after="40"/>
+              <w:ind w:firstLine="0"/>
+              <w:jc w:val="left"/>
+            </w:pPr>
             <w:r/>
             <w:r>
               <w:rPr>
-                <w:sz w:val="18"/>
+                <w:b w:val="0"/>
               </w:rPr>
-              <w:t>PASS</w:t>
+              <w:t>Pass</w:t>
             </w:r>
           </w:p>
         </w:tc>
       </w:tr>
       <w:tr>
+        <w:trPr>
+          <w:cantSplit w:val="true"/>
+        </w:trPr>
         <w:tc>
           <w:tcPr>
-            <w:tcW w:type="dxa" w:w="907"/>
+            <w:tcW w:type="dxa" w:w="945"/>
           </w:tcPr>
           <w:p>
+            <w:pPr>
+              <w:spacing w:line="240" w:lineRule="auto" w:before="40" w:after="40"/>
+              <w:ind w:firstLine="0"/>
+              <w:jc w:val="left"/>
+            </w:pPr>
             <w:r/>
             <w:r>
               <w:rPr>
-                <w:sz w:val="18"/>
+                <w:b w:val="0"/>
               </w:rPr>
               <w:t>FR-06</w:t>
             </w:r>
@@ -1258,13 +1838,18 @@
         </w:tc>
         <w:tc>
           <w:tcPr>
-            <w:tcW w:type="dxa" w:w="964"/>
+            <w:tcW w:type="dxa" w:w="1056"/>
           </w:tcPr>
           <w:p>
+            <w:pPr>
+              <w:spacing w:line="240" w:lineRule="auto" w:before="40" w:after="40"/>
+              <w:ind w:firstLine="0"/>
+              <w:jc w:val="left"/>
+            </w:pPr>
             <w:r/>
             <w:r>
               <w:rPr>
-                <w:sz w:val="18"/>
+                <w:b w:val="0"/>
               </w:rPr>
               <w:t>UC6</w:t>
             </w:r>
@@ -1272,43 +1857,61 @@
         </w:tc>
         <w:tc>
           <w:tcPr>
-            <w:tcW w:type="dxa" w:w="6236"/>
+            <w:tcW w:type="dxa" w:w="5560"/>
           </w:tcPr>
           <w:p>
+            <w:pPr>
+              <w:spacing w:line="240" w:lineRule="auto" w:before="40" w:after="40"/>
+              <w:ind w:firstLine="0"/>
+              <w:jc w:val="left"/>
+            </w:pPr>
             <w:r/>
             <w:r>
               <w:rPr>
-                <w:sz w:val="18"/>
+                <w:b w:val="0"/>
               </w:rPr>
-              <w:t>Elapsed working days computed against the 3 / 7 / 20-day tiers, excluding weekends and holidays entered by the administrator</w:t>
+              <w:t>Elapsed working days are computed against the 3-, 7-, and 20-day tiers, excluding weekends and holidays entered by the administrator</w:t>
             </w:r>
           </w:p>
         </w:tc>
         <w:tc>
           <w:tcPr>
-            <w:tcW w:type="dxa" w:w="964"/>
+            <w:tcW w:type="dxa" w:w="1056"/>
           </w:tcPr>
           <w:p>
+            <w:pPr>
+              <w:spacing w:line="240" w:lineRule="auto" w:before="40" w:after="40"/>
+              <w:ind w:firstLine="0"/>
+              <w:jc w:val="left"/>
+            </w:pPr>
             <w:r/>
             <w:r>
               <w:rPr>
-                <w:sz w:val="18"/>
+                <w:b w:val="0"/>
               </w:rPr>
-              <w:t>PASS</w:t>
+              <w:t>Pass</w:t>
             </w:r>
           </w:p>
         </w:tc>
       </w:tr>
       <w:tr>
+        <w:trPr>
+          <w:cantSplit w:val="true"/>
+        </w:trPr>
         <w:tc>
           <w:tcPr>
-            <w:tcW w:type="dxa" w:w="907"/>
+            <w:tcW w:type="dxa" w:w="945"/>
           </w:tcPr>
           <w:p>
+            <w:pPr>
+              <w:spacing w:line="240" w:lineRule="auto" w:before="40" w:after="40"/>
+              <w:ind w:firstLine="0"/>
+              <w:jc w:val="left"/>
+            </w:pPr>
             <w:r/>
             <w:r>
               <w:rPr>
-                <w:sz w:val="18"/>
+                <w:b w:val="0"/>
               </w:rPr>
               <w:t>FR-07</w:t>
             </w:r>
@@ -1316,13 +1919,18 @@
         </w:tc>
         <w:tc>
           <w:tcPr>
-            <w:tcW w:type="dxa" w:w="964"/>
+            <w:tcW w:type="dxa" w:w="1056"/>
           </w:tcPr>
           <w:p>
+            <w:pPr>
+              <w:spacing w:line="240" w:lineRule="auto" w:before="40" w:after="40"/>
+              <w:ind w:firstLine="0"/>
+              <w:jc w:val="left"/>
+            </w:pPr>
             <w:r/>
             <w:r>
               <w:rPr>
-                <w:sz w:val="18"/>
+                <w:b w:val="0"/>
               </w:rPr>
               <w:t>UC7</w:t>
             </w:r>
@@ -1330,43 +1938,61 @@
         </w:tc>
         <w:tc>
           <w:tcPr>
-            <w:tcW w:type="dxa" w:w="6236"/>
+            <w:tcW w:type="dxa" w:w="5560"/>
           </w:tcPr>
           <w:p>
+            <w:pPr>
+              <w:spacing w:line="240" w:lineRule="auto" w:before="40" w:after="40"/>
+              <w:ind w:firstLine="0"/>
+              <w:jc w:val="left"/>
+            </w:pPr>
             <w:r/>
             <w:r>
               <w:rPr>
-                <w:sz w:val="18"/>
+                <w:b w:val="0"/>
               </w:rPr>
-              <w:t>Volume, stage conversion and case aging for any date range; totals reconcile with the raw case list; CSV export</w:t>
+              <w:t>Volume, stage conversion, and case aging are reported for any date range; totals reconcile with the raw case list; the report exports to CSV</w:t>
             </w:r>
           </w:p>
         </w:tc>
         <w:tc>
           <w:tcPr>
-            <w:tcW w:type="dxa" w:w="964"/>
+            <w:tcW w:type="dxa" w:w="1056"/>
           </w:tcPr>
           <w:p>
+            <w:pPr>
+              <w:spacing w:line="240" w:lineRule="auto" w:before="40" w:after="40"/>
+              <w:ind w:firstLine="0"/>
+              <w:jc w:val="left"/>
+            </w:pPr>
             <w:r/>
             <w:r>
               <w:rPr>
-                <w:sz w:val="18"/>
+                <w:b w:val="0"/>
               </w:rPr>
-              <w:t>PASS</w:t>
+              <w:t>Pass</w:t>
             </w:r>
           </w:p>
         </w:tc>
       </w:tr>
       <w:tr>
+        <w:trPr>
+          <w:cantSplit w:val="true"/>
+        </w:trPr>
         <w:tc>
           <w:tcPr>
-            <w:tcW w:type="dxa" w:w="907"/>
+            <w:tcW w:type="dxa" w:w="945"/>
           </w:tcPr>
           <w:p>
+            <w:pPr>
+              <w:spacing w:line="240" w:lineRule="auto" w:before="40" w:after="40"/>
+              <w:ind w:firstLine="0"/>
+              <w:jc w:val="left"/>
+            </w:pPr>
             <w:r/>
             <w:r>
               <w:rPr>
-                <w:sz w:val="18"/>
+                <w:b w:val="0"/>
               </w:rPr>
               <w:t>FR-08</w:t>
             </w:r>
@@ -1374,13 +2000,18 @@
         </w:tc>
         <w:tc>
           <w:tcPr>
-            <w:tcW w:type="dxa" w:w="964"/>
+            <w:tcW w:type="dxa" w:w="1056"/>
           </w:tcPr>
           <w:p>
+            <w:pPr>
+              <w:spacing w:line="240" w:lineRule="auto" w:before="40" w:after="40"/>
+              <w:ind w:firstLine="0"/>
+              <w:jc w:val="left"/>
+            </w:pPr>
             <w:r/>
             <w:r>
               <w:rPr>
-                <w:sz w:val="18"/>
+                <w:b w:val="0"/>
               </w:rPr>
               <w:t>UC8</w:t>
             </w:r>
@@ -1388,43 +2019,61 @@
         </w:tc>
         <w:tc>
           <w:tcPr>
-            <w:tcW w:type="dxa" w:w="6236"/>
+            <w:tcW w:type="dxa" w:w="5560"/>
           </w:tcPr>
           <w:p>
+            <w:pPr>
+              <w:spacing w:line="240" w:lineRule="auto" w:before="40" w:after="40"/>
+              <w:ind w:firstLine="0"/>
+              <w:jc w:val="left"/>
+            </w:pPr>
             <w:r/>
             <w:r>
               <w:rPr>
-                <w:sz w:val="18"/>
+                <w:b w:val="0"/>
               </w:rPr>
-              <w:t>Consent statement text, timestamp and purpose stored for every inquiry and application; no consent, no record</w:t>
+              <w:t>Consent statement text, timestamp, and purpose are stored for every inquiry and application; no consent, no record</w:t>
             </w:r>
           </w:p>
         </w:tc>
         <w:tc>
           <w:tcPr>
-            <w:tcW w:type="dxa" w:w="964"/>
+            <w:tcW w:type="dxa" w:w="1056"/>
           </w:tcPr>
           <w:p>
+            <w:pPr>
+              <w:spacing w:line="240" w:lineRule="auto" w:before="40" w:after="40"/>
+              <w:ind w:firstLine="0"/>
+              <w:jc w:val="left"/>
+            </w:pPr>
             <w:r/>
             <w:r>
               <w:rPr>
-                <w:sz w:val="18"/>
+                <w:b w:val="0"/>
               </w:rPr>
-              <w:t>PASS</w:t>
+              <w:t>Pass</w:t>
             </w:r>
           </w:p>
         </w:tc>
       </w:tr>
       <w:tr>
+        <w:trPr>
+          <w:cantSplit w:val="true"/>
+        </w:trPr>
         <w:tc>
           <w:tcPr>
-            <w:tcW w:type="dxa" w:w="907"/>
+            <w:tcW w:type="dxa" w:w="945"/>
           </w:tcPr>
           <w:p>
+            <w:pPr>
+              <w:spacing w:line="240" w:lineRule="auto" w:before="40" w:after="40"/>
+              <w:ind w:firstLine="0"/>
+              <w:jc w:val="left"/>
+            </w:pPr>
             <w:r/>
             <w:r>
               <w:rPr>
-                <w:sz w:val="18"/>
+                <w:b w:val="0"/>
               </w:rPr>
               <w:t>FR-09</w:t>
             </w:r>
@@ -1432,13 +2081,18 @@
         </w:tc>
         <w:tc>
           <w:tcPr>
-            <w:tcW w:type="dxa" w:w="964"/>
+            <w:tcW w:type="dxa" w:w="1056"/>
           </w:tcPr>
           <w:p>
+            <w:pPr>
+              <w:spacing w:line="240" w:lineRule="auto" w:before="40" w:after="40"/>
+              <w:ind w:firstLine="0"/>
+              <w:jc w:val="left"/>
+            </w:pPr>
             <w:r/>
             <w:r>
               <w:rPr>
-                <w:sz w:val="18"/>
+                <w:b w:val="0"/>
               </w:rPr>
               <w:t>UC9</w:t>
             </w:r>
@@ -1446,43 +2100,61 @@
         </w:tc>
         <w:tc>
           <w:tcPr>
-            <w:tcW w:type="dxa" w:w="6236"/>
+            <w:tcW w:type="dxa" w:w="5560"/>
           </w:tcPr>
           <w:p>
+            <w:pPr>
+              <w:spacing w:line="240" w:lineRule="auto" w:before="40" w:after="40"/>
+              <w:ind w:firstLine="0"/>
+              <w:jc w:val="left"/>
+            </w:pPr>
             <w:r/>
             <w:r>
               <w:rPr>
-                <w:sz w:val="18"/>
+                <w:b w:val="0"/>
               </w:rPr>
-              <w:t>Reservation fee validated only with an official receipt number; a receipt number cannot be reused</w:t>
+              <w:t>A reservation fee is validated only with an official receipt number, and a receipt number cannot be reused</w:t>
             </w:r>
           </w:p>
         </w:tc>
         <w:tc>
           <w:tcPr>
-            <w:tcW w:type="dxa" w:w="964"/>
+            <w:tcW w:type="dxa" w:w="1056"/>
           </w:tcPr>
           <w:p>
+            <w:pPr>
+              <w:spacing w:line="240" w:lineRule="auto" w:before="40" w:after="40"/>
+              <w:ind w:firstLine="0"/>
+              <w:jc w:val="left"/>
+            </w:pPr>
             <w:r/>
             <w:r>
               <w:rPr>
-                <w:sz w:val="18"/>
+                <w:b w:val="0"/>
               </w:rPr>
-              <w:t>PASS</w:t>
+              <w:t>Pass</w:t>
             </w:r>
           </w:p>
         </w:tc>
       </w:tr>
       <w:tr>
+        <w:trPr>
+          <w:cantSplit w:val="true"/>
+        </w:trPr>
         <w:tc>
           <w:tcPr>
-            <w:tcW w:type="dxa" w:w="907"/>
+            <w:tcW w:type="dxa" w:w="945"/>
           </w:tcPr>
           <w:p>
+            <w:pPr>
+              <w:spacing w:line="240" w:lineRule="auto" w:before="40" w:after="40"/>
+              <w:ind w:firstLine="0"/>
+              <w:jc w:val="left"/>
+            </w:pPr>
             <w:r/>
             <w:r>
               <w:rPr>
-                <w:sz w:val="18"/>
+                <w:b w:val="0"/>
               </w:rPr>
               <w:t>FR-10</w:t>
             </w:r>
@@ -1490,13 +2162,18 @@
         </w:tc>
         <w:tc>
           <w:tcPr>
-            <w:tcW w:type="dxa" w:w="964"/>
+            <w:tcW w:type="dxa" w:w="1056"/>
           </w:tcPr>
           <w:p>
+            <w:pPr>
+              <w:spacing w:line="240" w:lineRule="auto" w:before="40" w:after="40"/>
+              <w:ind w:firstLine="0"/>
+              <w:jc w:val="left"/>
+            </w:pPr>
             <w:r/>
             <w:r>
               <w:rPr>
-                <w:sz w:val="18"/>
+                <w:b w:val="0"/>
               </w:rPr>
               <w:t>UC10</w:t>
             </w:r>
@@ -1504,43 +2181,61 @@
         </w:tc>
         <w:tc>
           <w:tcPr>
-            <w:tcW w:type="dxa" w:w="6236"/>
+            <w:tcW w:type="dxa" w:w="5560"/>
           </w:tcPr>
           <w:p>
+            <w:pPr>
+              <w:spacing w:line="240" w:lineRule="auto" w:before="40" w:after="40"/>
+              <w:ind w:firstLine="0"/>
+              <w:jc w:val="left"/>
+            </w:pPr>
             <w:r/>
             <w:r>
               <w:rPr>
-                <w:sz w:val="18"/>
+                <w:b w:val="0"/>
               </w:rPr>
-              <w:t>Deficiency notice lists each document still pending after its deadline; repeat runs do not duplicate notices</w:t>
+              <w:t>The deficiency notice lists each document still pending after its deadline; repeat runs do not duplicate notices</w:t>
             </w:r>
           </w:p>
         </w:tc>
         <w:tc>
           <w:tcPr>
-            <w:tcW w:type="dxa" w:w="964"/>
+            <w:tcW w:type="dxa" w:w="1056"/>
           </w:tcPr>
           <w:p>
+            <w:pPr>
+              <w:spacing w:line="240" w:lineRule="auto" w:before="40" w:after="40"/>
+              <w:ind w:firstLine="0"/>
+              <w:jc w:val="left"/>
+            </w:pPr>
             <w:r/>
             <w:r>
               <w:rPr>
-                <w:sz w:val="18"/>
+                <w:b w:val="0"/>
               </w:rPr>
-              <w:t>PASS</w:t>
+              <w:t>Pass</w:t>
             </w:r>
           </w:p>
         </w:tc>
       </w:tr>
       <w:tr>
+        <w:trPr>
+          <w:cantSplit w:val="true"/>
+        </w:trPr>
         <w:tc>
           <w:tcPr>
-            <w:tcW w:type="dxa" w:w="907"/>
+            <w:tcW w:type="dxa" w:w="945"/>
           </w:tcPr>
           <w:p>
+            <w:pPr>
+              <w:spacing w:line="240" w:lineRule="auto" w:before="40" w:after="40"/>
+              <w:ind w:firstLine="0"/>
+              <w:jc w:val="left"/>
+            </w:pPr>
             <w:r/>
             <w:r>
               <w:rPr>
-                <w:sz w:val="18"/>
+                <w:b w:val="0"/>
               </w:rPr>
               <w:t>FR-11</w:t>
             </w:r>
@@ -1548,13 +2243,18 @@
         </w:tc>
         <w:tc>
           <w:tcPr>
-            <w:tcW w:type="dxa" w:w="964"/>
+            <w:tcW w:type="dxa" w:w="1056"/>
           </w:tcPr>
           <w:p>
+            <w:pPr>
+              <w:spacing w:line="240" w:lineRule="auto" w:before="40" w:after="40"/>
+              <w:ind w:firstLine="0"/>
+              <w:jc w:val="left"/>
+            </w:pPr>
             <w:r/>
             <w:r>
               <w:rPr>
-                <w:sz w:val="18"/>
+                <w:b w:val="0"/>
               </w:rPr>
               <w:t>UC11</w:t>
             </w:r>
@@ -1562,43 +2262,61 @@
         </w:tc>
         <w:tc>
           <w:tcPr>
-            <w:tcW w:type="dxa" w:w="6236"/>
+            <w:tcW w:type="dxa" w:w="5560"/>
           </w:tcPr>
           <w:p>
+            <w:pPr>
+              <w:spacing w:line="240" w:lineRule="auto" w:before="40" w:after="40"/>
+              <w:ind w:firstLine="0"/>
+              <w:jc w:val="left"/>
+            </w:pPr>
             <w:r/>
             <w:r>
               <w:rPr>
-                <w:sz w:val="18"/>
+                <w:b w:val="0"/>
               </w:rPr>
-              <w:t>Endorsed case reaches the financial aid coordinator queue with the program document list</w:t>
+              <w:t>An endorsed case reaches the financial aid coordinator queue with the document list of its program</w:t>
             </w:r>
           </w:p>
         </w:tc>
         <w:tc>
           <w:tcPr>
-            <w:tcW w:type="dxa" w:w="964"/>
+            <w:tcW w:type="dxa" w:w="1056"/>
           </w:tcPr>
           <w:p>
+            <w:pPr>
+              <w:spacing w:line="240" w:lineRule="auto" w:before="40" w:after="40"/>
+              <w:ind w:firstLine="0"/>
+              <w:jc w:val="left"/>
+            </w:pPr>
             <w:r/>
             <w:r>
               <w:rPr>
-                <w:sz w:val="18"/>
+                <w:b w:val="0"/>
               </w:rPr>
-              <w:t>PASS</w:t>
+              <w:t>Pass</w:t>
             </w:r>
           </w:p>
         </w:tc>
       </w:tr>
       <w:tr>
+        <w:trPr>
+          <w:cantSplit w:val="true"/>
+        </w:trPr>
         <w:tc>
           <w:tcPr>
-            <w:tcW w:type="dxa" w:w="907"/>
+            <w:tcW w:type="dxa" w:w="945"/>
           </w:tcPr>
           <w:p>
+            <w:pPr>
+              <w:spacing w:line="240" w:lineRule="auto" w:before="40" w:after="40"/>
+              <w:ind w:firstLine="0"/>
+              <w:jc w:val="left"/>
+            </w:pPr>
             <w:r/>
             <w:r>
               <w:rPr>
-                <w:sz w:val="18"/>
+                <w:b w:val="0"/>
               </w:rPr>
               <w:t>FR-12</w:t>
             </w:r>
@@ -1606,13 +2324,18 @@
         </w:tc>
         <w:tc>
           <w:tcPr>
-            <w:tcW w:type="dxa" w:w="964"/>
+            <w:tcW w:type="dxa" w:w="1056"/>
           </w:tcPr>
           <w:p>
+            <w:pPr>
+              <w:spacing w:line="240" w:lineRule="auto" w:before="40" w:after="40"/>
+              <w:ind w:firstLine="0"/>
+              <w:jc w:val="left"/>
+            </w:pPr>
             <w:r/>
             <w:r>
               <w:rPr>
-                <w:sz w:val="18"/>
+                <w:b w:val="0"/>
               </w:rPr>
               <w:t>UC12</w:t>
             </w:r>
@@ -1620,43 +2343,61 @@
         </w:tc>
         <w:tc>
           <w:tcPr>
-            <w:tcW w:type="dxa" w:w="6236"/>
+            <w:tcW w:type="dxa" w:w="5560"/>
           </w:tcPr>
           <w:p>
+            <w:pPr>
+              <w:spacing w:line="240" w:lineRule="auto" w:before="40" w:after="40"/>
+              <w:ind w:firstLine="0"/>
+              <w:jc w:val="left"/>
+            </w:pPr>
             <w:r/>
             <w:r>
               <w:rPr>
-                <w:sz w:val="18"/>
+                <w:b w:val="0"/>
               </w:rPr>
-              <w:t>Opening a record requires a stated purpose; user, record, time and purpose are logged; applicants can download their own access log</w:t>
+              <w:t>Opening a record requires a stated purpose; the user, record, time, and purpose are logged, and applicants can download their own access log</w:t>
             </w:r>
           </w:p>
         </w:tc>
         <w:tc>
           <w:tcPr>
-            <w:tcW w:type="dxa" w:w="964"/>
+            <w:tcW w:type="dxa" w:w="1056"/>
           </w:tcPr>
           <w:p>
+            <w:pPr>
+              <w:spacing w:line="240" w:lineRule="auto" w:before="40" w:after="40"/>
+              <w:ind w:firstLine="0"/>
+              <w:jc w:val="left"/>
+            </w:pPr>
             <w:r/>
             <w:r>
               <w:rPr>
-                <w:sz w:val="18"/>
+                <w:b w:val="0"/>
               </w:rPr>
-              <w:t>PASS</w:t>
+              <w:t>Pass</w:t>
             </w:r>
           </w:p>
         </w:tc>
       </w:tr>
       <w:tr>
+        <w:trPr>
+          <w:cantSplit w:val="true"/>
+        </w:trPr>
         <w:tc>
           <w:tcPr>
-            <w:tcW w:type="dxa" w:w="907"/>
+            <w:tcW w:type="dxa" w:w="945"/>
           </w:tcPr>
           <w:p>
+            <w:pPr>
+              <w:spacing w:line="240" w:lineRule="auto" w:before="40" w:after="40"/>
+              <w:ind w:firstLine="0"/>
+              <w:jc w:val="left"/>
+            </w:pPr>
             <w:r/>
             <w:r>
               <w:rPr>
-                <w:sz w:val="18"/>
+                <w:b w:val="0"/>
               </w:rPr>
               <w:t>FR-13</w:t>
             </w:r>
@@ -1664,13 +2405,18 @@
         </w:tc>
         <w:tc>
           <w:tcPr>
-            <w:tcW w:type="dxa" w:w="964"/>
+            <w:tcW w:type="dxa" w:w="1056"/>
           </w:tcPr>
           <w:p>
+            <w:pPr>
+              <w:spacing w:line="240" w:lineRule="auto" w:before="40" w:after="40"/>
+              <w:ind w:firstLine="0"/>
+              <w:jc w:val="left"/>
+            </w:pPr>
             <w:r/>
             <w:r>
               <w:rPr>
-                <w:sz w:val="18"/>
+                <w:b w:val="0"/>
               </w:rPr>
               <w:t>UC13</w:t>
             </w:r>
@@ -1678,43 +2424,61 @@
         </w:tc>
         <w:tc>
           <w:tcPr>
-            <w:tcW w:type="dxa" w:w="6236"/>
+            <w:tcW w:type="dxa" w:w="5560"/>
           </w:tcPr>
           <w:p>
+            <w:pPr>
+              <w:spacing w:line="240" w:lineRule="auto" w:before="40" w:after="40"/>
+              <w:ind w:firstLine="0"/>
+              <w:jc w:val="left"/>
+            </w:pPr>
             <w:r/>
             <w:r>
               <w:rPr>
-                <w:sz w:val="18"/>
+                <w:b w:val="0"/>
               </w:rPr>
-              <w:t>Ticket owned by one named officer; cannot be resolved without a closing remark</w:t>
+              <w:t>Each ticket is owned by one named officer and cannot be resolved without a closing remark</w:t>
             </w:r>
           </w:p>
         </w:tc>
         <w:tc>
           <w:tcPr>
-            <w:tcW w:type="dxa" w:w="964"/>
+            <w:tcW w:type="dxa" w:w="1056"/>
           </w:tcPr>
           <w:p>
+            <w:pPr>
+              <w:spacing w:line="240" w:lineRule="auto" w:before="40" w:after="40"/>
+              <w:ind w:firstLine="0"/>
+              <w:jc w:val="left"/>
+            </w:pPr>
             <w:r/>
             <w:r>
               <w:rPr>
-                <w:sz w:val="18"/>
+                <w:b w:val="0"/>
               </w:rPr>
-              <w:t>PASS</w:t>
+              <w:t>Pass</w:t>
             </w:r>
           </w:p>
         </w:tc>
       </w:tr>
       <w:tr>
+        <w:trPr>
+          <w:cantSplit w:val="true"/>
+        </w:trPr>
         <w:tc>
           <w:tcPr>
-            <w:tcW w:type="dxa" w:w="907"/>
+            <w:tcW w:type="dxa" w:w="945"/>
           </w:tcPr>
           <w:p>
+            <w:pPr>
+              <w:spacing w:line="240" w:lineRule="auto" w:before="40" w:after="40"/>
+              <w:ind w:firstLine="0"/>
+              <w:jc w:val="left"/>
+            </w:pPr>
             <w:r/>
             <w:r>
               <w:rPr>
-                <w:sz w:val="18"/>
+                <w:b w:val="0"/>
               </w:rPr>
               <w:t>FR-14</w:t>
             </w:r>
@@ -1722,13 +2486,18 @@
         </w:tc>
         <w:tc>
           <w:tcPr>
-            <w:tcW w:type="dxa" w:w="964"/>
+            <w:tcW w:type="dxa" w:w="1056"/>
           </w:tcPr>
           <w:p>
+            <w:pPr>
+              <w:spacing w:line="240" w:lineRule="auto" w:before="40" w:after="40"/>
+              <w:ind w:firstLine="0"/>
+              <w:jc w:val="left"/>
+            </w:pPr>
             <w:r/>
             <w:r>
               <w:rPr>
-                <w:sz w:val="18"/>
+                <w:b w:val="0"/>
               </w:rPr>
               <w:t>UC14</w:t>
             </w:r>
@@ -1736,59 +2505,113 @@
         </w:tc>
         <w:tc>
           <w:tcPr>
-            <w:tcW w:type="dxa" w:w="6236"/>
+            <w:tcW w:type="dxa" w:w="5560"/>
           </w:tcPr>
           <w:p>
+            <w:pPr>
+              <w:spacing w:line="240" w:lineRule="auto" w:before="40" w:after="40"/>
+              <w:ind w:firstLine="0"/>
+              <w:jc w:val="left"/>
+            </w:pPr>
             <w:r/>
             <w:r>
               <w:rPr>
-                <w:sz w:val="18"/>
+                <w:b w:val="0"/>
               </w:rPr>
-              <w:t>Overdue ticket raised to the School Administrator queue; on-time tickets are not</w:t>
+              <w:t>An overdue ticket is raised to the School Administrator queue; on-time tickets are not</w:t>
             </w:r>
           </w:p>
         </w:tc>
         <w:tc>
           <w:tcPr>
-            <w:tcW w:type="dxa" w:w="964"/>
+            <w:tcW w:type="dxa" w:w="1056"/>
           </w:tcPr>
           <w:p>
+            <w:pPr>
+              <w:spacing w:line="240" w:lineRule="auto" w:before="40" w:after="40"/>
+              <w:ind w:firstLine="0"/>
+              <w:jc w:val="left"/>
+            </w:pPr>
             <w:r/>
             <w:r>
               <w:rPr>
-                <w:sz w:val="18"/>
+                <w:b w:val="0"/>
               </w:rPr>
-              <w:t>PASS</w:t>
+              <w:t>Pass</w:t>
             </w:r>
           </w:p>
         </w:tc>
       </w:tr>
     </w:tbl>
-    <w:p/>
+    <w:p>
+      <w:pPr>
+        <w:keepNext w:val="0"/>
+        <w:spacing w:line="240" w:lineRule="auto" w:before="0" w:after="0"/>
+        <w:ind w:firstLine="0"/>
+        <w:jc w:val="both"/>
+      </w:pPr>
+      <w:r/>
+    </w:p>
     <w:p>
       <w:pPr>
         <w:pStyle w:val="Heading1"/>
       </w:pPr>
       <w:r>
-        <w:t>4. Screens</w:t>
+        <w:t>Prototype Screens</w:t>
       </w:r>
     </w:p>
     <w:p>
       <w:pPr>
+        <w:keepNext w:val="0"/>
+        <w:spacing w:line="360" w:lineRule="auto" w:before="0" w:after="0"/>
+        <w:ind w:firstLine="720"/>
         <w:jc w:val="both"/>
       </w:pPr>
       <w:r>
-        <w:t>The screens below were captured from the running build with an automated browser. The landing page uses the 1921 x 1080 "Landing Page" frame and its #FFF5C3 fill from the team Figma file as its base.</w:t>
+        <w:t>Figures 1 to 6 were captured from the running prototype with an automated browser on October 28, 2026. The landing page uses the 1921 × 1080 Landing Page frame and its #FFF5C3 fill from the team's Figma file as its base.</w:t>
       </w:r>
     </w:p>
     <w:p>
       <w:pPr>
+        <w:keepNext/>
+        <w:spacing w:line="240" w:lineRule="auto" w:before="240" w:after="0"/>
+        <w:ind w:firstLine="0"/>
+        <w:jc w:val="left"/>
+      </w:pPr>
+      <w:r>
+        <w:rPr>
+          <w:b/>
+          <w:i w:val="0"/>
+        </w:rPr>
+        <w:t>Figure 1</w:t>
+      </w:r>
+    </w:p>
+    <w:p>
+      <w:pPr>
+        <w:keepNext/>
+        <w:spacing w:line="240" w:lineRule="auto" w:before="0" w:after="120"/>
+        <w:ind w:firstLine="0"/>
+        <w:jc w:val="left"/>
+      </w:pPr>
+      <w:r>
+        <w:rPr>
+          <w:b w:val="0"/>
+          <w:i/>
+        </w:rPr>
+        <w:t>Landing Page With the Looping Background Video</w:t>
+      </w:r>
+    </w:p>
+    <w:p>
+      <w:pPr>
+        <w:keepNext/>
+        <w:spacing w:line="240" w:lineRule="auto"/>
+        <w:ind w:firstLine="0"/>
         <w:jc w:val="center"/>
       </w:pPr>
       <w:r>
         <w:drawing>
           <wp:inline xmlns:a="http://schemas.openxmlformats.org/drawingml/2006/main" xmlns:pic="http://schemas.openxmlformats.org/drawingml/2006/picture">
-            <wp:extent cx="5580000" cy="3138750"/>
+            <wp:extent cx="5486400" cy="3093578"/>
             <wp:docPr id="1" name="Picture 1"/>
             <wp:cNvGraphicFramePr>
               <a:graphicFrameLocks noChangeAspect="1"/>
@@ -1797,11 +2620,11 @@
               <a:graphicData uri="http://schemas.openxmlformats.org/drawingml/2006/picture">
                 <pic:pic>
                   <pic:nvPicPr>
-                    <pic:cNvPr id="0" name="01-landing.png"/>
+                    <pic:cNvPr id="0" name="framed-01-landing.png"/>
                     <pic:cNvPicPr/>
                   </pic:nvPicPr>
                   <pic:blipFill>
-                    <a:blip r:embed="rId9"/>
+                    <a:blip r:embed="rId10"/>
                     <a:stretch>
                       <a:fillRect/>
                     </a:stretch>
@@ -1809,7 +2632,7 @@
                   <pic:spPr>
                     <a:xfrm>
                       <a:off x="0" y="0"/>
-                      <a:ext cx="5580000" cy="3138750"/>
+                      <a:ext cx="5486400" cy="3093578"/>
                     </a:xfrm>
                     <a:prstGeom prst="rect"/>
                   </pic:spPr>
@@ -1822,24 +2645,63 @@
     </w:p>
     <w:p>
       <w:pPr>
-        <w:jc w:val="center"/>
+        <w:keepNext w:val="0"/>
+        <w:spacing w:line="240" w:lineRule="auto" w:before="120" w:after="240"/>
+        <w:ind w:firstLine="0"/>
+        <w:jc w:val="both"/>
       </w:pPr>
       <w:r>
         <w:rPr>
+          <w:b w:val="0"/>
           <w:i/>
-          <w:sz w:val="20"/>
         </w:rPr>
-        <w:t>Figure 2. Landing page with the looping background video (desktop).</w:t>
+        <w:t>Note.</w:t>
+      </w:r>
+      <w:r>
+        <w:t xml:space="preserve"> Desktop view seen by applicants and parents before signing in.</w:t>
       </w:r>
     </w:p>
     <w:p>
       <w:pPr>
+        <w:keepNext/>
+        <w:spacing w:line="240" w:lineRule="auto" w:before="240" w:after="0"/>
+        <w:ind w:firstLine="0"/>
+        <w:jc w:val="left"/>
+      </w:pPr>
+      <w:r>
+        <w:rPr>
+          <w:b/>
+          <w:i w:val="0"/>
+        </w:rPr>
+        <w:t>Figure 2</w:t>
+      </w:r>
+    </w:p>
+    <w:p>
+      <w:pPr>
+        <w:keepNext/>
+        <w:spacing w:line="240" w:lineRule="auto" w:before="0" w:after="120"/>
+        <w:ind w:firstLine="0"/>
+        <w:jc w:val="left"/>
+      </w:pPr>
+      <w:r>
+        <w:rPr>
+          <w:b w:val="0"/>
+          <w:i/>
+        </w:rPr>
+        <w:t>Applicant Dashboard</w:t>
+      </w:r>
+    </w:p>
+    <w:p>
+      <w:pPr>
+        <w:keepNext/>
+        <w:spacing w:line="240" w:lineRule="auto"/>
+        <w:ind w:firstLine="0"/>
         <w:jc w:val="center"/>
       </w:pPr>
       <w:r>
         <w:drawing>
           <wp:inline xmlns:a="http://schemas.openxmlformats.org/drawingml/2006/main" xmlns:pic="http://schemas.openxmlformats.org/drawingml/2006/picture">
-            <wp:extent cx="5580000" cy="4647094"/>
+            <wp:extent cx="5486400" cy="4572000"/>
             <wp:docPr id="2" name="Picture 2"/>
             <wp:cNvGraphicFramePr>
               <a:graphicFrameLocks noChangeAspect="1"/>
@@ -1848,11 +2710,11 @@
               <a:graphicData uri="http://schemas.openxmlformats.org/drawingml/2006/picture">
                 <pic:pic>
                   <pic:nvPicPr>
-                    <pic:cNvPr id="0" name="05-applicant-dashboard.png"/>
+                    <pic:cNvPr id="0" name="framed-05-applicant-dashboard.png"/>
                     <pic:cNvPicPr/>
                   </pic:nvPicPr>
                   <pic:blipFill>
-                    <a:blip r:embed="rId10"/>
+                    <a:blip r:embed="rId11"/>
                     <a:stretch>
                       <a:fillRect/>
                     </a:stretch>
@@ -1860,7 +2722,7 @@
                   <pic:spPr>
                     <a:xfrm>
                       <a:off x="0" y="0"/>
-                      <a:ext cx="5580000" cy="4647094"/>
+                      <a:ext cx="5486400" cy="4572000"/>
                     </a:xfrm>
                     <a:prstGeom prst="rect"/>
                   </pic:spPr>
@@ -1873,24 +2735,63 @@
     </w:p>
     <w:p>
       <w:pPr>
-        <w:jc w:val="center"/>
+        <w:keepNext w:val="0"/>
+        <w:spacing w:line="240" w:lineRule="auto" w:before="120" w:after="240"/>
+        <w:ind w:firstLine="0"/>
+        <w:jc w:val="both"/>
       </w:pPr>
       <w:r>
         <w:rPr>
+          <w:b w:val="0"/>
           <w:i/>
-          <w:sz w:val="20"/>
         </w:rPr>
-        <w:t>Figure 3. Applicant dashboard: stage, requirements, subsidy matches, questions, consent (UC3, UC4, UC5, UC8).</w:t>
+        <w:t>Note.</w:t>
+      </w:r>
+      <w:r>
+        <w:t xml:space="preserve"> Shows the application stage, requirement status, subsidy matches, inquiries, and consent records (UC3, UC4, UC5, UC8).</w:t>
       </w:r>
     </w:p>
     <w:p>
       <w:pPr>
+        <w:keepNext/>
+        <w:spacing w:line="240" w:lineRule="auto" w:before="240" w:after="0"/>
+        <w:ind w:firstLine="0"/>
+        <w:jc w:val="left"/>
+      </w:pPr>
+      <w:r>
+        <w:rPr>
+          <w:b/>
+          <w:i w:val="0"/>
+        </w:rPr>
+        <w:t>Figure 3</w:t>
+      </w:r>
+    </w:p>
+    <w:p>
+      <w:pPr>
+        <w:keepNext/>
+        <w:spacing w:line="240" w:lineRule="auto" w:before="0" w:after="120"/>
+        <w:ind w:firstLine="0"/>
+        <w:jc w:val="left"/>
+      </w:pPr>
+      <w:r>
+        <w:rPr>
+          <w:b w:val="0"/>
+          <w:i/>
+        </w:rPr>
+        <w:t>Admissions Officer Ticket Queue</w:t>
+      </w:r>
+    </w:p>
+    <w:p>
+      <w:pPr>
+        <w:keepNext/>
+        <w:spacing w:line="240" w:lineRule="auto"/>
+        <w:ind w:firstLine="0"/>
         <w:jc w:val="center"/>
       </w:pPr>
       <w:r>
         <w:drawing>
           <wp:inline xmlns:a="http://schemas.openxmlformats.org/drawingml/2006/main" xmlns:pic="http://schemas.openxmlformats.org/drawingml/2006/picture">
-            <wp:extent cx="5580000" cy="3138750"/>
+            <wp:extent cx="5486400" cy="3093578"/>
             <wp:docPr id="3" name="Picture 3"/>
             <wp:cNvGraphicFramePr>
               <a:graphicFrameLocks noChangeAspect="1"/>
@@ -1899,11 +2800,11 @@
               <a:graphicData uri="http://schemas.openxmlformats.org/drawingml/2006/picture">
                 <pic:pic>
                   <pic:nvPicPr>
-                    <pic:cNvPr id="0" name="06-tickets.png"/>
+                    <pic:cNvPr id="0" name="framed-06-tickets.png"/>
                     <pic:cNvPicPr/>
                   </pic:nvPicPr>
                   <pic:blipFill>
-                    <a:blip r:embed="rId11"/>
+                    <a:blip r:embed="rId12"/>
                     <a:stretch>
                       <a:fillRect/>
                     </a:stretch>
@@ -1911,7 +2812,7 @@
                   <pic:spPr>
                     <a:xfrm>
                       <a:off x="0" y="0"/>
-                      <a:ext cx="5580000" cy="3138750"/>
+                      <a:ext cx="5486400" cy="3093578"/>
                     </a:xfrm>
                     <a:prstGeom prst="rect"/>
                   </pic:spPr>
@@ -1924,24 +2825,63 @@
     </w:p>
     <w:p>
       <w:pPr>
-        <w:jc w:val="center"/>
+        <w:keepNext w:val="0"/>
+        <w:spacing w:line="240" w:lineRule="auto" w:before="120" w:after="240"/>
+        <w:ind w:firstLine="0"/>
+        <w:jc w:val="both"/>
       </w:pPr>
       <w:r>
         <w:rPr>
+          <w:b w:val="0"/>
           <w:i/>
-          <w:sz w:val="20"/>
         </w:rPr>
-        <w:t>Figure 4. Officer ticket queue with service-level clock (UC6, UC13).</w:t>
+        <w:t>Note.</w:t>
+      </w:r>
+      <w:r>
+        <w:t xml:space="preserve"> Each ticket shows its owner and its elapsed working days against its service tier (UC6, UC13).</w:t>
       </w:r>
     </w:p>
     <w:p>
       <w:pPr>
+        <w:keepNext/>
+        <w:spacing w:line="240" w:lineRule="auto" w:before="240" w:after="0"/>
+        <w:ind w:firstLine="0"/>
+        <w:jc w:val="left"/>
+      </w:pPr>
+      <w:r>
+        <w:rPr>
+          <w:b/>
+          <w:i w:val="0"/>
+        </w:rPr>
+        <w:t>Figure 4</w:t>
+      </w:r>
+    </w:p>
+    <w:p>
+      <w:pPr>
+        <w:keepNext/>
+        <w:spacing w:line="240" w:lineRule="auto" w:before="0" w:after="120"/>
+        <w:ind w:firstLine="0"/>
+        <w:jc w:val="left"/>
+      </w:pPr>
+      <w:r>
+        <w:rPr>
+          <w:b w:val="0"/>
+          <w:i/>
+        </w:rPr>
+        <w:t>Staff View of an Applicant Record</w:t>
+      </w:r>
+    </w:p>
+    <w:p>
+      <w:pPr>
+        <w:keepNext/>
+        <w:spacing w:line="240" w:lineRule="auto"/>
+        <w:ind w:firstLine="0"/>
         <w:jc w:val="center"/>
       </w:pPr>
       <w:r>
         <w:drawing>
           <wp:inline xmlns:a="http://schemas.openxmlformats.org/drawingml/2006/main" xmlns:pic="http://schemas.openxmlformats.org/drawingml/2006/picture">
-            <wp:extent cx="5580000" cy="4836000"/>
+            <wp:extent cx="5486400" cy="4757159"/>
             <wp:docPr id="4" name="Picture 4"/>
             <wp:cNvGraphicFramePr>
               <a:graphicFrameLocks noChangeAspect="1"/>
@@ -1950,11 +2890,11 @@
               <a:graphicData uri="http://schemas.openxmlformats.org/drawingml/2006/picture">
                 <pic:pic>
                   <pic:nvPicPr>
-                    <pic:cNvPr id="0" name="13-applicant-record.png"/>
+                    <pic:cNvPr id="0" name="framed-13-applicant-record.png"/>
                     <pic:cNvPicPr/>
                   </pic:nvPicPr>
                   <pic:blipFill>
-                    <a:blip r:embed="rId12"/>
+                    <a:blip r:embed="rId13"/>
                     <a:stretch>
                       <a:fillRect/>
                     </a:stretch>
@@ -1962,7 +2902,7 @@
                   <pic:spPr>
                     <a:xfrm>
                       <a:off x="0" y="0"/>
-                      <a:ext cx="5580000" cy="4836000"/>
+                      <a:ext cx="5486400" cy="4757159"/>
                     </a:xfrm>
                     <a:prstGeom prst="rect"/>
                   </pic:spPr>
@@ -1975,24 +2915,63 @@
     </w:p>
     <w:p>
       <w:pPr>
-        <w:jc w:val="center"/>
+        <w:keepNext w:val="0"/>
+        <w:spacing w:line="240" w:lineRule="auto" w:before="120" w:after="240"/>
+        <w:ind w:firstLine="0"/>
+        <w:jc w:val="both"/>
       </w:pPr>
       <w:r>
         <w:rPr>
+          <w:b w:val="0"/>
           <w:i/>
-          <w:sz w:val="20"/>
         </w:rPr>
-        <w:t>Figure 5. Staff view of an applicant record: compliance, payment, aid endorsement (UC3, UC9, UC10, UC11).</w:t>
+        <w:t>Note.</w:t>
+      </w:r>
+      <w:r>
+        <w:t xml:space="preserve"> Covers requirement compliance, reservation fee validation, and subsidy endorsement (UC3, UC9, UC10, UC11).</w:t>
       </w:r>
     </w:p>
     <w:p>
       <w:pPr>
+        <w:keepNext/>
+        <w:spacing w:line="240" w:lineRule="auto" w:before="240" w:after="0"/>
+        <w:ind w:firstLine="0"/>
+        <w:jc w:val="left"/>
+      </w:pPr>
+      <w:r>
+        <w:rPr>
+          <w:b/>
+          <w:i w:val="0"/>
+        </w:rPr>
+        <w:t>Figure 5</w:t>
+      </w:r>
+    </w:p>
+    <w:p>
+      <w:pPr>
+        <w:keepNext/>
+        <w:spacing w:line="240" w:lineRule="auto" w:before="0" w:after="120"/>
+        <w:ind w:firstLine="0"/>
+        <w:jc w:val="left"/>
+      </w:pPr>
+      <w:r>
+        <w:rPr>
+          <w:b w:val="0"/>
+          <w:i/>
+        </w:rPr>
+        <w:t>Admissions Analytics for the School Administrator</w:t>
+      </w:r>
+    </w:p>
+    <w:p>
+      <w:pPr>
+        <w:keepNext/>
+        <w:spacing w:line="240" w:lineRule="auto"/>
+        <w:ind w:firstLine="0"/>
         <w:jc w:val="center"/>
       </w:pPr>
       <w:r>
         <w:drawing>
           <wp:inline xmlns:a="http://schemas.openxmlformats.org/drawingml/2006/main" xmlns:pic="http://schemas.openxmlformats.org/drawingml/2006/picture">
-            <wp:extent cx="5580000" cy="3138750"/>
+            <wp:extent cx="5486400" cy="3093578"/>
             <wp:docPr id="5" name="Picture 5"/>
             <wp:cNvGraphicFramePr>
               <a:graphicFrameLocks noChangeAspect="1"/>
@@ -2001,11 +2980,11 @@
               <a:graphicData uri="http://schemas.openxmlformats.org/drawingml/2006/picture">
                 <pic:pic>
                   <pic:nvPicPr>
-                    <pic:cNvPr id="0" name="09-analytics.png"/>
+                    <pic:cNvPr id="0" name="framed-09-analytics.png"/>
                     <pic:cNvPicPr/>
                   </pic:nvPicPr>
                   <pic:blipFill>
-                    <a:blip r:embed="rId13"/>
+                    <a:blip r:embed="rId14"/>
                     <a:stretch>
                       <a:fillRect/>
                     </a:stretch>
@@ -2013,7 +2992,7 @@
                   <pic:spPr>
                     <a:xfrm>
                       <a:off x="0" y="0"/>
-                      <a:ext cx="5580000" cy="3138750"/>
+                      <a:ext cx="5486400" cy="3093578"/>
                     </a:xfrm>
                     <a:prstGeom prst="rect"/>
                   </pic:spPr>
@@ -2026,24 +3005,63 @@
     </w:p>
     <w:p>
       <w:pPr>
-        <w:jc w:val="center"/>
+        <w:keepNext w:val="0"/>
+        <w:spacing w:line="240" w:lineRule="auto" w:before="120" w:after="240"/>
+        <w:ind w:firstLine="0"/>
+        <w:jc w:val="both"/>
       </w:pPr>
       <w:r>
         <w:rPr>
+          <w:b w:val="0"/>
           <w:i/>
-          <w:sz w:val="20"/>
         </w:rPr>
-        <w:t>Figure 6. Admissions analytics for the School Administrator (UC7).</w:t>
+        <w:t>Note.</w:t>
+      </w:r>
+      <w:r>
+        <w:t xml:space="preserve"> Inquiry volume, service-level compliance, stage conversion, and case aging for a selected date range (UC7).</w:t>
       </w:r>
     </w:p>
     <w:p>
       <w:pPr>
+        <w:keepNext/>
+        <w:spacing w:line="240" w:lineRule="auto" w:before="240" w:after="0"/>
+        <w:ind w:firstLine="0"/>
+        <w:jc w:val="left"/>
+      </w:pPr>
+      <w:r>
+        <w:rPr>
+          <w:b/>
+          <w:i w:val="0"/>
+        </w:rPr>
+        <w:t>Figure 6</w:t>
+      </w:r>
+    </w:p>
+    <w:p>
+      <w:pPr>
+        <w:keepNext/>
+        <w:spacing w:line="240" w:lineRule="auto" w:before="0" w:after="120"/>
+        <w:ind w:firstLine="0"/>
+        <w:jc w:val="left"/>
+      </w:pPr>
+      <w:r>
+        <w:rPr>
+          <w:b w:val="0"/>
+          <w:i/>
+        </w:rPr>
+        <w:t>Personal Data Access Log for the Data Protection Officer</w:t>
+      </w:r>
+    </w:p>
+    <w:p>
+      <w:pPr>
+        <w:keepNext/>
+        <w:spacing w:line="240" w:lineRule="auto"/>
+        <w:ind w:firstLine="0"/>
         <w:jc w:val="center"/>
       </w:pPr>
       <w:r>
         <w:drawing>
           <wp:inline xmlns:a="http://schemas.openxmlformats.org/drawingml/2006/main" xmlns:pic="http://schemas.openxmlformats.org/drawingml/2006/picture">
-            <wp:extent cx="5580000" cy="4513406"/>
+            <wp:extent cx="5486400" cy="4440964"/>
             <wp:docPr id="6" name="Picture 6"/>
             <wp:cNvGraphicFramePr>
               <a:graphicFrameLocks noChangeAspect="1"/>
@@ -2052,11 +3070,11 @@
               <a:graphicData uri="http://schemas.openxmlformats.org/drawingml/2006/picture">
                 <pic:pic>
                   <pic:nvPicPr>
-                    <pic:cNvPr id="0" name="10-audit.png"/>
+                    <pic:cNvPr id="0" name="framed-10-audit.png"/>
                     <pic:cNvPicPr/>
                   </pic:nvPicPr>
                   <pic:blipFill>
-                    <a:blip r:embed="rId14"/>
+                    <a:blip r:embed="rId15"/>
                     <a:stretch>
                       <a:fillRect/>
                     </a:stretch>
@@ -2064,7 +3082,7 @@
                   <pic:spPr>
                     <a:xfrm>
                       <a:off x="0" y="0"/>
-                      <a:ext cx="5580000" cy="4513406"/>
+                      <a:ext cx="5486400" cy="4440964"/>
                     </a:xfrm>
                     <a:prstGeom prst="rect"/>
                   </pic:spPr>
@@ -2077,14 +3095,20 @@
     </w:p>
     <w:p>
       <w:pPr>
-        <w:jc w:val="center"/>
+        <w:keepNext w:val="0"/>
+        <w:spacing w:line="240" w:lineRule="auto" w:before="120" w:after="240"/>
+        <w:ind w:firstLine="0"/>
+        <w:jc w:val="both"/>
       </w:pPr>
       <w:r>
         <w:rPr>
+          <w:b w:val="0"/>
           <w:i/>
-          <w:sz w:val="20"/>
         </w:rPr>
-        <w:t>Figure 7. Personal data access log for the Data Protection Officer (UC12).</w:t>
+        <w:t>Note.</w:t>
+      </w:r>
+      <w:r>
+        <w:t xml:space="preserve"> Each entry records who opened which applicant record, when, and for what stated purpose (UC12).</w:t>
       </w:r>
     </w:p>
     <w:p>
@@ -2092,15 +3116,18 @@
         <w:pStyle w:val="Heading1"/>
       </w:pPr>
       <w:r>
-        <w:t>5. Background Video</w:t>
+        <w:t>Background Video</w:t>
       </w:r>
     </w:p>
     <w:p>
       <w:pPr>
+        <w:keepNext w:val="0"/>
+        <w:spacing w:line="360" w:lineRule="auto" w:before="0" w:after="0"/>
+        <w:ind w:firstLine="720"/>
         <w:jc w:val="both"/>
       </w:pPr>
       <w:r>
-        <w:t>The landing page plays a 12-second seamless loop at 30 frames per second, 1280 x 720, 6.3 MB, H.264. It shows a slow fall down the core of an abandoned orbital station. Camera speed and the amber warning lamps pulse at 140 beats per minute. The largest frame-to-frame brightness change is {video["max_delta"]:.2f} of 255 levels, far below the WCAG 2.3.1 flash threshold. The video is muted, carries no information, and has a Pause control. It does not autoplay for visitors who set "reduce motion" on their device.</w:t>
+        <w:t>The landing page plays a 12-second seamless loop at 30 frames per second, 1280 × 720 pixels, 6.3 MB, encoded in H.264. It shows a slow fall down the core of an abandoned orbital station. Camera speed and the amber warning lamps pulse at 140 beats per minute. The largest frame-to-frame brightness change is 1.56 of 255 levels, far below the flash threshold of Success Criterion 2.3.1 (World Wide Web Consortium, 2023). The video is muted, carries no information, and has a Pause control. It does not play automatically for visitors who set their device to reduce motion.</w:t>
       </w:r>
     </w:p>
     <w:p>
@@ -2108,44 +3135,93 @@
         <w:pStyle w:val="Heading1"/>
       </w:pPr>
       <w:r>
-        <w:t>6. Member Contributions</w:t>
+        <w:t>Member Contributions</w:t>
       </w:r>
     </w:p>
     <w:p>
       <w:pPr>
+        <w:keepNext w:val="0"/>
+        <w:spacing w:line="360" w:lineRule="auto" w:before="0" w:after="0"/>
+        <w:ind w:firstLine="720"/>
         <w:jc w:val="both"/>
       </w:pPr>
       <w:r>
-        <w:t>Each member signs his own row to confirm the contribution listed.</w:t>
+        <w:t>Table 4 lists the role and contribution of each member. Each member signs his own row to confirm the contribution listed.</w:t>
+      </w:r>
+    </w:p>
+    <w:p>
+      <w:pPr>
+        <w:keepNext/>
+        <w:spacing w:line="240" w:lineRule="auto" w:before="240" w:after="0"/>
+        <w:ind w:firstLine="0"/>
+        <w:jc w:val="left"/>
+      </w:pPr>
+      <w:r>
+        <w:rPr>
+          <w:b/>
+          <w:i w:val="0"/>
+        </w:rPr>
+        <w:t>Table 4</w:t>
+      </w:r>
+    </w:p>
+    <w:p>
+      <w:pPr>
+        <w:keepNext/>
+        <w:spacing w:line="240" w:lineRule="auto" w:before="0" w:after="120"/>
+        <w:ind w:firstLine="0"/>
+        <w:jc w:val="left"/>
+      </w:pPr>
+      <w:r>
+        <w:rPr>
+          <w:b w:val="0"/>
+          <w:i/>
+        </w:rPr>
+        <w:t>Member Roles and Contributions</w:t>
       </w:r>
     </w:p>
     <w:tbl>
       <w:tblPr>
-        <w:tblStyle w:val="TableGrid"/>
         <w:tblW w:type="auto" w:w="0"/>
         <w:jc w:val="center"/>
         <w:tblLayout w:type="fixed"/>
         <w:tblLook w:firstColumn="1" w:firstRow="1" w:lastColumn="0" w:lastRow="0" w:noHBand="0" w:noVBand="1" w:val="04A0"/>
         <w:tblLayout w:type="fixed"/>
+        <w:tblBorders>
+          <w:top w:val="single" w:sz="8" w:space="0" w:color="000000"/>
+          <w:left w:val="nil"/>
+          <w:bottom w:val="single" w:sz="8" w:space="0" w:color="000000"/>
+          <w:right w:val="nil"/>
+          <w:insideH w:val="single" w:sz="8" w:space="0" w:color="000000"/>
+          <w:insideV w:val="nil"/>
+        </w:tblBorders>
       </w:tblPr>
       <w:tblGrid>
-        <w:gridCol w:w="2268"/>
-        <w:gridCol w:w="1927"/>
-        <w:gridCol w:w="3402"/>
-        <w:gridCol w:w="1701"/>
+        <w:gridCol w:w="2154"/>
+        <w:gridCol w:w="1831"/>
+        <w:gridCol w:w="3124"/>
+        <w:gridCol w:w="1508"/>
       </w:tblGrid>
       <w:tr>
+        <w:trPr>
+          <w:tblHeader w:val="true"/>
+        </w:trPr>
         <w:tc>
           <w:tcPr>
-            <w:tcW w:type="dxa" w:w="2268"/>
-            <w:shd w:val="clear" w:color="auto" w:fill="D9D9D9"/>
+            <w:tcW w:type="dxa" w:w="2154"/>
+            <w:tcBorders>
+              <w:bottom w:val="single" w:sz="8" w:space="0" w:color="000000"/>
+            </w:tcBorders>
           </w:tcPr>
           <w:p>
+            <w:pPr>
+              <w:spacing w:line="240" w:lineRule="auto" w:before="40" w:after="40"/>
+              <w:ind w:firstLine="0"/>
+              <w:jc w:val="left"/>
+            </w:pPr>
             <w:r/>
             <w:r>
               <w:rPr>
                 <w:b/>
-                <w:sz w:val="20"/>
               </w:rPr>
               <w:t>Member</w:t>
             </w:r>
@@ -2153,15 +3229,21 @@
         </w:tc>
         <w:tc>
           <w:tcPr>
-            <w:tcW w:type="dxa" w:w="1928"/>
-            <w:shd w:val="clear" w:color="auto" w:fill="D9D9D9"/>
+            <w:tcW w:type="dxa" w:w="1831"/>
+            <w:tcBorders>
+              <w:bottom w:val="single" w:sz="8" w:space="0" w:color="000000"/>
+            </w:tcBorders>
           </w:tcPr>
           <w:p>
+            <w:pPr>
+              <w:spacing w:line="240" w:lineRule="auto" w:before="40" w:after="40"/>
+              <w:ind w:firstLine="0"/>
+              <w:jc w:val="left"/>
+            </w:pPr>
             <w:r/>
             <w:r>
               <w:rPr>
                 <w:b/>
-                <w:sz w:val="20"/>
               </w:rPr>
               <w:t>Role</w:t>
             </w:r>
@@ -2169,15 +3251,21 @@
         </w:tc>
         <w:tc>
           <w:tcPr>
-            <w:tcW w:type="dxa" w:w="3402"/>
-            <w:shd w:val="clear" w:color="auto" w:fill="D9D9D9"/>
+            <w:tcW w:type="dxa" w:w="3124"/>
+            <w:tcBorders>
+              <w:bottom w:val="single" w:sz="8" w:space="0" w:color="000000"/>
+            </w:tcBorders>
           </w:tcPr>
           <w:p>
+            <w:pPr>
+              <w:spacing w:line="240" w:lineRule="auto" w:before="40" w:after="40"/>
+              <w:ind w:firstLine="0"/>
+              <w:jc w:val="left"/>
+            </w:pPr>
             <w:r/>
             <w:r>
               <w:rPr>
                 <w:b/>
-                <w:sz w:val="20"/>
               </w:rPr>
               <w:t>Contribution</w:t>
             </w:r>
@@ -2185,15 +3273,21 @@
         </w:tc>
         <w:tc>
           <w:tcPr>
-            <w:tcW w:type="dxa" w:w="1701"/>
-            <w:shd w:val="clear" w:color="auto" w:fill="D9D9D9"/>
+            <w:tcW w:type="dxa" w:w="1508"/>
+            <w:tcBorders>
+              <w:bottom w:val="single" w:sz="8" w:space="0" w:color="000000"/>
+            </w:tcBorders>
           </w:tcPr>
           <w:p>
+            <w:pPr>
+              <w:spacing w:line="240" w:lineRule="auto" w:before="40" w:after="40"/>
+              <w:ind w:firstLine="0"/>
+              <w:jc w:val="left"/>
+            </w:pPr>
             <w:r/>
             <w:r>
               <w:rPr>
                 <w:b/>
-                <w:sz w:val="20"/>
               </w:rPr>
               <w:t>Signature</w:t>
             </w:r>
@@ -2202,17 +3296,23 @@
       </w:tr>
       <w:tr>
         <w:trPr>
-          <w:trHeight w:val="794"/>
+          <w:cantSplit w:val="true"/>
+          <w:trHeight w:val="907"/>
         </w:trPr>
         <w:tc>
           <w:tcPr>
-            <w:tcW w:type="dxa" w:w="2268"/>
+            <w:tcW w:type="dxa" w:w="2154"/>
           </w:tcPr>
           <w:p>
+            <w:pPr>
+              <w:spacing w:line="240" w:lineRule="auto" w:before="40" w:after="40"/>
+              <w:ind w:firstLine="0"/>
+              <w:jc w:val="left"/>
+            </w:pPr>
             <w:r/>
             <w:r>
               <w:rPr>
-                <w:sz w:val="20"/>
+                <w:b w:val="0"/>
               </w:rPr>
               <w:t>Atienza, Kurt Judd P.</w:t>
             </w:r>
@@ -2220,13 +3320,18 @@
         </w:tc>
         <w:tc>
           <w:tcPr>
-            <w:tcW w:type="dxa" w:w="1928"/>
+            <w:tcW w:type="dxa" w:w="1831"/>
           </w:tcPr>
           <w:p>
+            <w:pPr>
+              <w:spacing w:line="240" w:lineRule="auto" w:before="40" w:after="40"/>
+              <w:ind w:firstLine="0"/>
+              <w:jc w:val="left"/>
+            </w:pPr>
             <w:r/>
             <w:r>
               <w:rPr>
-                <w:sz w:val="20"/>
+                <w:b w:val="0"/>
               </w:rPr>
               <w:t>Project Lead</w:t>
             </w:r>
@@ -2234,27 +3339,37 @@
         </w:tc>
         <w:tc>
           <w:tcPr>
-            <w:tcW w:type="dxa" w:w="3402"/>
+            <w:tcW w:type="dxa" w:w="3124"/>
           </w:tcPr>
           <w:p>
+            <w:pPr>
+              <w:spacing w:line="240" w:lineRule="auto" w:before="40" w:after="40"/>
+              <w:ind w:firstLine="0"/>
+              <w:jc w:val="left"/>
+            </w:pPr>
             <w:r/>
             <w:r>
               <w:rPr>
-                <w:sz w:val="20"/>
+                <w:b w:val="0"/>
               </w:rPr>
-              <w:t>Designed the landing frame in Figma; directed the AI-assisted build of the back end, database and test suite; integrated and tested the prototype</w:t>
+              <w:t>Designed the landing frame in Figma; directed the AI-assisted build of the back end, database, and test suite; integrated and tested the prototype</w:t>
             </w:r>
           </w:p>
         </w:tc>
         <w:tc>
           <w:tcPr>
-            <w:tcW w:type="dxa" w:w="1701"/>
+            <w:tcW w:type="dxa" w:w="1508"/>
           </w:tcPr>
           <w:p>
+            <w:pPr>
+              <w:spacing w:line="240" w:lineRule="auto" w:before="40" w:after="40"/>
+              <w:ind w:firstLine="0"/>
+              <w:jc w:val="left"/>
+            </w:pPr>
             <w:r/>
             <w:r>
               <w:rPr>
-                <w:sz w:val="20"/>
+                <w:b w:val="0"/>
               </w:rPr>
             </w:r>
           </w:p>
@@ -2262,17 +3377,23 @@
       </w:tr>
       <w:tr>
         <w:trPr>
-          <w:trHeight w:val="794"/>
+          <w:cantSplit w:val="true"/>
+          <w:trHeight w:val="907"/>
         </w:trPr>
         <w:tc>
           <w:tcPr>
-            <w:tcW w:type="dxa" w:w="2268"/>
+            <w:tcW w:type="dxa" w:w="2154"/>
           </w:tcPr>
           <w:p>
+            <w:pPr>
+              <w:spacing w:line="240" w:lineRule="auto" w:before="40" w:after="40"/>
+              <w:ind w:firstLine="0"/>
+              <w:jc w:val="left"/>
+            </w:pPr>
             <w:r/>
             <w:r>
               <w:rPr>
-                <w:sz w:val="20"/>
+                <w:b w:val="0"/>
               </w:rPr>
               <w:t>Garonia, Ian Humprey M.</w:t>
             </w:r>
@@ -2280,13 +3401,18 @@
         </w:tc>
         <w:tc>
           <w:tcPr>
-            <w:tcW w:type="dxa" w:w="1928"/>
+            <w:tcW w:type="dxa" w:w="1831"/>
           </w:tcPr>
           <w:p>
+            <w:pPr>
+              <w:spacing w:line="240" w:lineRule="auto" w:before="40" w:after="40"/>
+              <w:ind w:firstLine="0"/>
+              <w:jc w:val="left"/>
+            </w:pPr>
             <w:r/>
             <w:r>
               <w:rPr>
-                <w:sz w:val="20"/>
+                <w:b w:val="0"/>
               </w:rPr>
               <w:t>UX/UI Designer and Tester</w:t>
             </w:r>
@@ -2294,13 +3420,18 @@
         </w:tc>
         <w:tc>
           <w:tcPr>
-            <w:tcW w:type="dxa" w:w="3402"/>
+            <w:tcW w:type="dxa" w:w="3124"/>
           </w:tcPr>
           <w:p>
+            <w:pPr>
+              <w:spacing w:line="240" w:lineRule="auto" w:before="40" w:after="40"/>
+              <w:ind w:firstLine="0"/>
+              <w:jc w:val="left"/>
+            </w:pPr>
             <w:r/>
             <w:r>
               <w:rPr>
-                <w:sz w:val="20"/>
+                <w:b w:val="0"/>
               </w:rPr>
               <w:t>Designed screens in Figma; tested the prototype</w:t>
             </w:r>
@@ -2308,13 +3439,18 @@
         </w:tc>
         <w:tc>
           <w:tcPr>
-            <w:tcW w:type="dxa" w:w="1701"/>
+            <w:tcW w:type="dxa" w:w="1508"/>
           </w:tcPr>
           <w:p>
+            <w:pPr>
+              <w:spacing w:line="240" w:lineRule="auto" w:before="40" w:after="40"/>
+              <w:ind w:firstLine="0"/>
+              <w:jc w:val="left"/>
+            </w:pPr>
             <w:r/>
             <w:r>
               <w:rPr>
-                <w:sz w:val="20"/>
+                <w:b w:val="0"/>
               </w:rPr>
             </w:r>
           </w:p>
@@ -2322,17 +3458,23 @@
       </w:tr>
       <w:tr>
         <w:trPr>
-          <w:trHeight w:val="794"/>
+          <w:cantSplit w:val="true"/>
+          <w:trHeight w:val="907"/>
         </w:trPr>
         <w:tc>
           <w:tcPr>
-            <w:tcW w:type="dxa" w:w="2268"/>
+            <w:tcW w:type="dxa" w:w="2154"/>
           </w:tcPr>
           <w:p>
+            <w:pPr>
+              <w:spacing w:line="240" w:lineRule="auto" w:before="40" w:after="40"/>
+              <w:ind w:firstLine="0"/>
+              <w:jc w:val="left"/>
+            </w:pPr>
             <w:r/>
             <w:r>
               <w:rPr>
-                <w:sz w:val="20"/>
+                <w:b w:val="0"/>
               </w:rPr>
               <w:t>Apura, Alexis H.</w:t>
             </w:r>
@@ -2340,13 +3482,18 @@
         </w:tc>
         <w:tc>
           <w:tcPr>
-            <w:tcW w:type="dxa" w:w="1928"/>
+            <w:tcW w:type="dxa" w:w="1831"/>
           </w:tcPr>
           <w:p>
+            <w:pPr>
+              <w:spacing w:line="240" w:lineRule="auto" w:before="40" w:after="40"/>
+              <w:ind w:firstLine="0"/>
+              <w:jc w:val="left"/>
+            </w:pPr>
             <w:r/>
             <w:r>
               <w:rPr>
-                <w:sz w:val="20"/>
+                <w:b w:val="0"/>
               </w:rPr>
               <w:t>UX/UI Designer and Tester</w:t>
             </w:r>
@@ -2354,13 +3501,18 @@
         </w:tc>
         <w:tc>
           <w:tcPr>
-            <w:tcW w:type="dxa" w:w="3402"/>
+            <w:tcW w:type="dxa" w:w="3124"/>
           </w:tcPr>
           <w:p>
+            <w:pPr>
+              <w:spacing w:line="240" w:lineRule="auto" w:before="40" w:after="40"/>
+              <w:ind w:firstLine="0"/>
+              <w:jc w:val="left"/>
+            </w:pPr>
             <w:r/>
             <w:r>
               <w:rPr>
-                <w:sz w:val="20"/>
+                <w:b w:val="0"/>
               </w:rPr>
               <w:t>Designed screens in Figma; tested the prototype</w:t>
             </w:r>
@@ -2368,13 +3520,18 @@
         </w:tc>
         <w:tc>
           <w:tcPr>
-            <w:tcW w:type="dxa" w:w="1701"/>
+            <w:tcW w:type="dxa" w:w="1508"/>
           </w:tcPr>
           <w:p>
+            <w:pPr>
+              <w:spacing w:line="240" w:lineRule="auto" w:before="40" w:after="40"/>
+              <w:ind w:firstLine="0"/>
+              <w:jc w:val="left"/>
+            </w:pPr>
             <w:r/>
             <w:r>
               <w:rPr>
-                <w:sz w:val="20"/>
+                <w:b w:val="0"/>
               </w:rPr>
             </w:r>
           </w:p>
@@ -2382,17 +3539,23 @@
       </w:tr>
       <w:tr>
         <w:trPr>
-          <w:trHeight w:val="794"/>
+          <w:cantSplit w:val="true"/>
+          <w:trHeight w:val="907"/>
         </w:trPr>
         <w:tc>
           <w:tcPr>
-            <w:tcW w:type="dxa" w:w="2268"/>
+            <w:tcW w:type="dxa" w:w="2154"/>
           </w:tcPr>
           <w:p>
+            <w:pPr>
+              <w:spacing w:line="240" w:lineRule="auto" w:before="40" w:after="40"/>
+              <w:ind w:firstLine="0"/>
+              <w:jc w:val="left"/>
+            </w:pPr>
             <w:r/>
             <w:r>
               <w:rPr>
-                <w:sz w:val="20"/>
+                <w:b w:val="0"/>
               </w:rPr>
               <w:t>Tenedo, Francis Gerald G.</w:t>
             </w:r>
@@ -2400,13 +3563,18 @@
         </w:tc>
         <w:tc>
           <w:tcPr>
-            <w:tcW w:type="dxa" w:w="1928"/>
+            <w:tcW w:type="dxa" w:w="1831"/>
           </w:tcPr>
           <w:p>
+            <w:pPr>
+              <w:spacing w:line="240" w:lineRule="auto" w:before="40" w:after="40"/>
+              <w:ind w:firstLine="0"/>
+              <w:jc w:val="left"/>
+            </w:pPr>
             <w:r/>
             <w:r>
               <w:rPr>
-                <w:sz w:val="20"/>
+                <w:b w:val="0"/>
               </w:rPr>
               <w:t>UX/UI Designer and Tester</w:t>
             </w:r>
@@ -2414,13 +3582,18 @@
         </w:tc>
         <w:tc>
           <w:tcPr>
-            <w:tcW w:type="dxa" w:w="3402"/>
+            <w:tcW w:type="dxa" w:w="3124"/>
           </w:tcPr>
           <w:p>
+            <w:pPr>
+              <w:spacing w:line="240" w:lineRule="auto" w:before="40" w:after="40"/>
+              <w:ind w:firstLine="0"/>
+              <w:jc w:val="left"/>
+            </w:pPr>
             <w:r/>
             <w:r>
               <w:rPr>
-                <w:sz w:val="20"/>
+                <w:b w:val="0"/>
               </w:rPr>
               <w:t>Designed screens in Figma; tested the prototype</w:t>
             </w:r>
@@ -2428,20 +3601,38 @@
         </w:tc>
         <w:tc>
           <w:tcPr>
-            <w:tcW w:type="dxa" w:w="1701"/>
+            <w:tcW w:type="dxa" w:w="1508"/>
           </w:tcPr>
           <w:p>
+            <w:pPr>
+              <w:spacing w:line="240" w:lineRule="auto" w:before="40" w:after="40"/>
+              <w:ind w:firstLine="0"/>
+              <w:jc w:val="left"/>
+            </w:pPr>
             <w:r/>
             <w:r>
               <w:rPr>
-                <w:sz w:val="20"/>
+                <w:b w:val="0"/>
               </w:rPr>
             </w:r>
           </w:p>
         </w:tc>
       </w:tr>
     </w:tbl>
-    <w:p/>
+    <w:p>
+      <w:pPr>
+        <w:keepNext w:val="0"/>
+        <w:spacing w:line="240" w:lineRule="auto" w:before="0" w:after="0"/>
+        <w:ind w:firstLine="0"/>
+        <w:jc w:val="both"/>
+      </w:pPr>
+      <w:r/>
+    </w:p>
+    <w:p>
+      <w:r>
+        <w:br w:type="page"/>
+      </w:r>
+    </w:p>
     <w:p>
       <w:pPr>
         <w:pStyle w:val="Heading1"/>
@@ -2452,52 +3643,157 @@
     </w:p>
     <w:p>
       <w:pPr>
+        <w:keepNext w:val="0"/>
+        <w:spacing w:line="240" w:lineRule="auto" w:before="0" w:after="240"/>
         <w:ind w:left="720" w:hanging="720"/>
+        <w:jc w:val="left"/>
       </w:pPr>
       <w:r>
-        <w:t>Cloudflare. (2026, April 21). Data security. Cloudflare D1 docs. https://developers.cloudflare.com/d1/reference/data-security/</w:t>
+        <w:t xml:space="preserve">Cloudflare. (2026, April 21). </w:t>
+      </w:r>
+      <w:r>
+        <w:rPr>
+          <w:b w:val="0"/>
+          <w:i/>
+        </w:rPr>
+        <w:t>Data security</w:t>
+      </w:r>
+      <w:r>
+        <w:t>. Cloudflare D1 Docs. https://developers.cloudflare.com/d1/reference/data-security/</w:t>
       </w:r>
     </w:p>
     <w:p>
       <w:pPr>
+        <w:keepNext w:val="0"/>
+        <w:spacing w:line="240" w:lineRule="auto" w:before="0" w:after="240"/>
         <w:ind w:left="720" w:hanging="720"/>
+        <w:jc w:val="left"/>
       </w:pPr>
       <w:r>
-        <w:t>Department of Education. (n.d.). Senior high school voucher program guidelines. https://depedroxi.ph/voucher-program/</w:t>
+        <w:t xml:space="preserve">Department of Education. (n.d.). </w:t>
+      </w:r>
+      <w:r>
+        <w:rPr>
+          <w:b w:val="0"/>
+          <w:i/>
+        </w:rPr>
+        <w:t>Senior high school voucher program guidelines</w:t>
+      </w:r>
+      <w:r>
+        <w:t>. DepEd Region XI. https://depedroxi.ph/voucher-program/</w:t>
       </w:r>
     </w:p>
     <w:p>
       <w:pPr>
+        <w:keepNext w:val="0"/>
+        <w:spacing w:line="240" w:lineRule="auto" w:before="0" w:after="240"/>
         <w:ind w:left="720" w:hanging="720"/>
+        <w:jc w:val="left"/>
       </w:pPr>
       <w:r>
-        <w:t>STI Education Services Group. (n.d.). Admissions. https://www.sti.edu/admissions.asp</w:t>
+        <w:t xml:space="preserve">STI Education Services Group. (n.d.). </w:t>
+      </w:r>
+      <w:r>
+        <w:rPr>
+          <w:b w:val="0"/>
+          <w:i/>
+        </w:rPr>
+        <w:t>Admissions</w:t>
+      </w:r>
+      <w:r>
+        <w:t>. https://www.sti.edu/admissions.asp</w:t>
       </w:r>
     </w:p>
     <w:p>
       <w:pPr>
+        <w:keepNext w:val="0"/>
+        <w:spacing w:line="240" w:lineRule="auto" w:before="0" w:after="240"/>
         <w:ind w:left="720" w:hanging="720"/>
+        <w:jc w:val="left"/>
       </w:pPr>
       <w:r>
-        <w:t>Unified Student Financial Assistance System for Tertiary Education. (n.d.). Tertiary education subsidy and Tulong Dunong program. https://unifast.gov.ph/tes.html</w:t>
+        <w:t xml:space="preserve">Unified Student Financial Assistance System for Tertiary Education. (n.d.). </w:t>
+      </w:r>
+      <w:r>
+        <w:rPr>
+          <w:b w:val="0"/>
+          <w:i/>
+        </w:rPr>
+        <w:t>Tertiary education subsidy and Tulong Dunong program</w:t>
+      </w:r>
+      <w:r>
+        <w:t>. https://unifast.gov.ph/tes.html</w:t>
       </w:r>
     </w:p>
     <w:p>
       <w:pPr>
+        <w:keepNext w:val="0"/>
+        <w:spacing w:line="240" w:lineRule="auto" w:before="0" w:after="240"/>
         <w:ind w:left="720" w:hanging="720"/>
+        <w:jc w:val="left"/>
       </w:pPr>
       <w:r>
-        <w:t>World Wide Web Consortium. (2023). Web Content Accessibility Guidelines (WCAG) 2.2. https://www.w3.org/TR/WCAG22/</w:t>
+        <w:t xml:space="preserve">World Wide Web Consortium. (2023). </w:t>
+      </w:r>
+      <w:r>
+        <w:rPr>
+          <w:b w:val="0"/>
+          <w:i/>
+        </w:rPr>
+        <w:t>Web content accessibility guidelines (WCAG) 2.2</w:t>
+      </w:r>
+      <w:r>
+        <w:t>. https://www.w3.org/TR/WCAG22/</w:t>
       </w:r>
     </w:p>
     <w:sectPr>
+      <w:footerReference w:type="default" r:id="rId9"/>
       <w:pgSz w:w="12240" w:h="15840"/>
-      <w:pgMar w:top="1440" w:right="1440" w:bottom="1440" w:left="1440" w:header="720" w:footer="720" w:gutter="0"/>
+      <w:pgMar w:top="1440" w:right="1440" w:bottom="1440" w:left="2160" w:header="720" w:footer="720" w:gutter="0"/>
       <w:cols w:space="720"/>
+      <w:titlePg/>
       <w:docGrid w:linePitch="360"/>
     </w:sectPr>
   </w:body>
 </w:document>
+</file>
+
+<file path=word/footer1.xml><?xml version="1.0" encoding="utf-8"?>
+<w:ftr xmlns:m="http://schemas.openxmlformats.org/officeDocument/2006/math" xmlns:mc="http://schemas.openxmlformats.org/markup-compatibility/2006" xmlns:mo="http://schemas.microsoft.com/office/mac/office/2008/main" xmlns:mv="urn:schemas-microsoft-com:mac:vml" xmlns:o="urn:schemas-microsoft-com:office:office" xmlns:r="http://schemas.openxmlformats.org/officeDocument/2006/relationships" xmlns:v="urn:schemas-microsoft-com:vml" xmlns:w10="urn:schemas-microsoft-com:office:word" xmlns:w14="http://schemas.microsoft.com/office/word/2010/wordml" xmlns:w="http://schemas.openxmlformats.org/wordprocessingml/2006/main" xmlns:wne="http://schemas.microsoft.com/office/word/2006/wordml" xmlns:wp14="http://schemas.microsoft.com/office/word/2010/wordprocessingDrawing" xmlns:wp="http://schemas.openxmlformats.org/drawingml/2006/wordprocessingDrawing" xmlns:wpc="http://schemas.microsoft.com/office/word/2010/wordprocessingCanvas" xmlns:wpg="http://schemas.microsoft.com/office/word/2010/wordprocessingGroup" xmlns:wpi="http://schemas.microsoft.com/office/word/2010/wordprocessingInk" xmlns:wps="http://schemas.microsoft.com/office/word/2010/wordprocessingShape" mc:Ignorable="w14 wp14">
+  <w:p>
+    <w:pPr>
+      <w:pStyle w:val="Footer"/>
+      <w:tabs>
+        <w:tab w:pos="4680" w:val="clear"/>
+        <w:tab w:pos="8640" w:val="right"/>
+        <w:tab w:pos="9360" w:val="clear"/>
+      </w:tabs>
+      <w:spacing w:line="240" w:lineRule="auto"/>
+      <w:ind w:firstLine="0"/>
+    </w:pPr>
+    <w:r>
+      <w:t>STI College Lipa</w:t>
+    </w:r>
+    <w:r>
+      <w:tab/>
+    </w:r>
+    <w:r>
+      <w:fldChar w:fldCharType="begin"/>
+    </w:r>
+    <w:r>
+      <w:instrText xml:space="preserve">PAGE</w:instrText>
+    </w:r>
+    <w:r>
+      <w:fldChar w:fldCharType="separate"/>
+    </w:r>
+    <w:r>
+      <w:t>2</w:t>
+    </w:r>
+    <w:r>
+      <w:fldChar w:fldCharType="end"/>
+    </w:r>
+  </w:p>
+</w:ftr>
 </file>
 
 <file path=word/numbering.xml><?xml version="1.0" encoding="utf-8"?>
@@ -2864,10 +4160,11 @@
     <w:qFormat/>
     <w:rsid w:val="00FC693F"/>
     <w:pPr>
-      <w:spacing w:after="120" w:line="276" w:lineRule="auto"/>
+      <w:spacing w:line="360" w:lineRule="auto" w:before="0" w:after="0"/>
     </w:pPr>
     <w:rPr>
-      <w:rFonts w:ascii="Times New Roman" w:hAnsi="Times New Roman" w:eastAsia="Times New Roman"/>
+      <w:rFonts w:ascii="Times New Roman" w:hAnsi="Times New Roman" w:eastAsia="Times New Roman" w:cs="Times New Roman"/>
+      <w:color w:val="000000"/>
       <w:sz w:val="24"/>
     </w:rPr>
   </w:style>
@@ -2907,6 +4204,11 @@
       </w:tabs>
       <w:spacing w:after="0" w:line="240" w:lineRule="auto"/>
     </w:pPr>
+    <w:rPr>
+      <w:rFonts w:ascii="Times New Roman" w:hAnsi="Times New Roman" w:eastAsia="Times New Roman" w:cs="Times New Roman"/>
+      <w:color w:val="000000"/>
+      <w:sz w:val="24"/>
+    </w:rPr>
   </w:style>
   <w:style w:type="character" w:customStyle="1" w:styleId="FooterChar">
     <w:name w:val="Footer Char"/>
@@ -2926,15 +4228,17 @@
     <w:pPr>
       <w:keepNext/>
       <w:keepLines/>
-      <w:spacing w:before="480" w:after="0"/>
+      <w:spacing w:before="240" w:after="0" w:line="360" w:lineRule="auto"/>
+      <w:jc w:val="center"/>
       <w:outlineLvl w:val="0"/>
     </w:pPr>
     <w:rPr>
-      <w:rFonts w:asciiTheme="majorHAnsi" w:eastAsiaTheme="majorEastAsia" w:hAnsiTheme="majorHAnsi" w:cstheme="majorBidi" w:ascii="Times New Roman" w:hAnsi="Times New Roman" w:eastAsia="Times New Roman"/>
+      <w:rFonts w:ascii="Times New Roman" w:hAnsi="Times New Roman" w:eastAsia="Times New Roman" w:cs="Times New Roman"/>
       <w:b/>
       <w:bCs/>
+      <w:i w:val="0"/>
       <w:color w:val="000000"/>
-      <w:sz w:val="28"/>
+      <w:sz w:val="24"/>
       <w:szCs w:val="28"/>
     </w:rPr>
   </w:style>
@@ -2950,13 +4254,15 @@
     <w:pPr>
       <w:keepNext/>
       <w:keepLines/>
-      <w:spacing w:before="200" w:after="0"/>
+      <w:spacing w:before="240" w:after="0" w:line="360" w:lineRule="auto"/>
+      <w:jc w:val="left"/>
       <w:outlineLvl w:val="1"/>
     </w:pPr>
     <w:rPr>
-      <w:rFonts w:asciiTheme="majorHAnsi" w:eastAsiaTheme="majorEastAsia" w:hAnsiTheme="majorHAnsi" w:cstheme="majorBidi" w:ascii="Times New Roman" w:hAnsi="Times New Roman" w:eastAsia="Times New Roman"/>
+      <w:rFonts w:ascii="Times New Roman" w:hAnsi="Times New Roman" w:eastAsia="Times New Roman" w:cs="Times New Roman"/>
       <w:b/>
       <w:bCs/>
+      <w:i w:val="0"/>
       <w:color w:val="000000"/>
       <w:sz w:val="24"/>
       <w:szCs w:val="26"/>
@@ -2978,10 +4284,10 @@
       <w:outlineLvl w:val="2"/>
     </w:pPr>
     <w:rPr>
-      <w:rFonts w:asciiTheme="majorHAnsi" w:eastAsiaTheme="majorEastAsia" w:hAnsiTheme="majorHAnsi" w:cstheme="majorBidi" w:ascii="Times New Roman" w:hAnsi="Times New Roman" w:eastAsia="Times New Roman"/>
+      <w:rFonts w:asciiTheme="majorHAnsi" w:eastAsiaTheme="majorEastAsia" w:hAnsiTheme="majorHAnsi" w:cstheme="majorBidi"/>
       <w:b/>
       <w:bCs/>
-      <w:color w:val="000000"/>
+      <w:color w:val="4F81BD" w:themeColor="accent1"/>
     </w:rPr>
   </w:style>
   <w:style w:type="paragraph" w:styleId="Heading4">

</xml_diff>